<commit_message>
Sync lessons 1-9 parent feedback to Word
</commit_message>
<xml_diff>
--- a/家长反馈/反馈1–9课.docx
+++ b/家长反馈/反馈1–9课.docx
@@ -72,13 +72,7 @@
     </w:p>
     <w:p>
       <w:r>
-        <w:rPr>
-          <w:color w:val="80627D"/>
-        </w:rPr>
-        <w:t xml:space="preserve">在引导下，由元宝提出可能影响单摆周期的因素：摆长、摆锤质量、释放角度和摆的高度（其中“摆的高度”是她在教案之外自己提出的变量）。</w:t>
-      </w:r>
-      <w:r>
-        <w:t xml:space="preserve">随后我们围绕提出的这四个因素进行对比实验。</w:t>
+        <w:t xml:space="preserve">在引导下，由元宝提出可能影响单摆周期的因素：摆长、摆锤质量、释放角度和摆的高度（其中“摆的高度”是她在教案之外自己提出的变量）。随后我们围绕提出的这四个因素进行对比实验。</w:t>
       </w:r>
     </w:p>
     <w:p>
@@ -170,13 +164,7 @@
         <w:t xml:space="preserve">实验 4｜改变摆的高度height：</w:t>
       </w:r>
       <w:r>
-        <w:rPr>
-          <w:color w:val="80627D"/>
-        </w:rPr>
-        <w:t xml:space="preserve">元宝自己提出的变量。</w:t>
-      </w:r>
-      <w:r>
-        <w:t xml:space="preserve">把整个单摆装置调高或调低，其他条件保持不变。</w:t>
+        <w:t xml:space="preserve">元宝自己提出的变量。把整个单摆装置调高或调低，其他条件保持不变。</w:t>
       </w:r>
     </w:p>
     <w:p>
@@ -318,7 +306,6 @@
           <w:ilvl w:val="1"/>
           <w:numId w:val="1"/>
         </w:numPr>
-        <w:spacing w:after="70"/>
       </w:pPr>
       <w:r>
         <w:rPr>
@@ -339,7 +326,6 @@
           <w:ilvl w:val="1"/>
           <w:numId w:val="1"/>
         </w:numPr>
-        <w:spacing w:after="70"/>
       </w:pPr>
       <w:r>
         <w:rPr>
@@ -360,7 +346,6 @@
           <w:ilvl w:val="1"/>
           <w:numId w:val="1"/>
         </w:numPr>
-        <w:spacing w:after="70"/>
       </w:pPr>
       <w:r>
         <w:rPr>
@@ -501,7 +486,6 @@
           <w:ilvl w:val="1"/>
           <w:numId w:val="1"/>
         </w:numPr>
-        <w:spacing w:after="70"/>
       </w:pPr>
       <w:r>
         <w:rPr>
@@ -522,7 +506,6 @@
           <w:ilvl w:val="1"/>
           <w:numId w:val="1"/>
         </w:numPr>
-        <w:spacing w:after="70"/>
       </w:pPr>
       <w:r>
         <w:rPr>
@@ -543,7 +526,6 @@
           <w:ilvl w:val="1"/>
           <w:numId w:val="1"/>
         </w:numPr>
-        <w:spacing w:after="70"/>
       </w:pPr>
       <w:r>
         <w:rPr>
@@ -2382,7 +2364,6 @@
           <w:ilvl w:val="1"/>
           <w:numId w:val="1"/>
         </w:numPr>
-        <w:spacing w:after="70"/>
       </w:pPr>
       <w:r>
         <w:rPr>
@@ -2403,7 +2384,6 @@
           <w:ilvl w:val="1"/>
           <w:numId w:val="1"/>
         </w:numPr>
-        <w:spacing w:after="70"/>
       </w:pPr>
       <w:r>
         <w:rPr>
@@ -2702,7 +2682,6 @@
           <w:ilvl w:val="1"/>
           <w:numId w:val="1"/>
         </w:numPr>
-        <w:spacing w:after="70"/>
       </w:pPr>
       <w:r>
         <w:rPr>
@@ -2743,7 +2722,6 @@
           <w:ilvl w:val="1"/>
           <w:numId w:val="1"/>
         </w:numPr>
-        <w:spacing w:after="70"/>
       </w:pPr>
       <w:r>
         <w:rPr>
@@ -2764,7 +2742,6 @@
           <w:ilvl w:val="1"/>
           <w:numId w:val="1"/>
         </w:numPr>
-        <w:spacing w:after="70"/>
       </w:pPr>
       <w:r>
         <w:rPr>
@@ -2841,7 +2818,6 @@
           <w:ilvl w:val="1"/>
           <w:numId w:val="1"/>
         </w:numPr>
-        <w:spacing w:after="70"/>
       </w:pPr>
       <w:r>
         <w:rPr>
@@ -2862,7 +2838,6 @@
           <w:ilvl w:val="1"/>
           <w:numId w:val="1"/>
         </w:numPr>
-        <w:spacing w:after="70"/>
       </w:pPr>
       <w:r>
         <w:rPr>
@@ -2894,6 +2869,26 @@
       </w:r>
       <w:r>
         <w:t xml:space="preserve">光遇到物质，可以被反射（reflection，返回）、透射（transmission，穿过）或吸收（absorption）。</w:t>
+      </w:r>
+    </w:p>
+    <w:p>
+      <w:pPr>
+        <w:pStyle w:val="ParentBullet"/>
+        <w:numPr>
+          <w:ilvl w:val="0"/>
+          <w:numId w:val="1"/>
+        </w:numPr>
+      </w:pPr>
+      <w:r>
+        <w:rPr>
+          <w:b/>
+          <w:bCs/>
+          <w:color w:val="0B2545"/>
+        </w:rPr>
+        <w:t xml:space="preserve">课末｜显微镜操作：</w:t>
+      </w:r>
+      <w:r>
+        <w:t xml:space="preserve">我们观察了现成样片，练习切换物镜倍数、粗调对焦，并移动玻片寻找观察区域。</w:t>
       </w:r>
     </w:p>
     <w:p>
@@ -2998,7 +2993,6 @@
           <w:ilvl w:val="1"/>
           <w:numId w:val="1"/>
         </w:numPr>
-        <w:spacing w:after="70"/>
       </w:pPr>
       <w:r>
         <w:rPr>
@@ -3061,7 +3055,6 @@
           <w:ilvl w:val="1"/>
           <w:numId w:val="1"/>
         </w:numPr>
-        <w:spacing w:after="70"/>
       </w:pPr>
       <w:r>
         <w:rPr>
@@ -3082,7 +3075,6 @@
           <w:ilvl w:val="1"/>
           <w:numId w:val="1"/>
         </w:numPr>
-        <w:spacing w:after="70"/>
       </w:pPr>
       <w:r>
         <w:rPr>
@@ -3103,7 +3095,6 @@
           <w:ilvl w:val="1"/>
           <w:numId w:val="1"/>
         </w:numPr>
-        <w:spacing w:after="70"/>
       </w:pPr>
       <w:r>
         <w:rPr>
@@ -3124,7 +3115,6 @@
           <w:ilvl w:val="1"/>
           <w:numId w:val="1"/>
         </w:numPr>
-        <w:spacing w:after="70"/>
       </w:pPr>
       <w:r>
         <w:rPr>
@@ -3197,43 +3187,14 @@
         <w:pStyle w:val="2"/>
       </w:pPr>
       <w:r>
-        <w:t>第</w:t>
-      </w:r>
-      <w:r>
-        <w:t xml:space="preserve"> 7 </w:t>
-      </w:r>
-      <w:r>
-        <w:t>次课｜看不见的空气，怎样留下证据？</w:t>
+        <w:t xml:space="preserve">第 7 次课｜看不见的空气，怎样留下证据？</w:t>
       </w:r>
       <w:r>
         <w:rPr>
           <w:sz w:val="21"/>
-        </w:rPr>
-        <w:t>｜</w:t>
-      </w:r>
-      <w:r>
-        <w:rPr>
-          <w:sz w:val="21"/>
-        </w:rPr>
-        <w:t>8</w:t>
-      </w:r>
-      <w:r>
-        <w:rPr>
-          <w:sz w:val="21"/>
-        </w:rPr>
-        <w:t>月</w:t>
-      </w:r>
-      <w:r>
-        <w:rPr>
-          <w:sz w:val="21"/>
-        </w:rPr>
-        <w:t>4</w:t>
-      </w:r>
-      <w:r>
-        <w:rPr>
-          <w:sz w:val="21"/>
-        </w:rPr>
-        <w:t>日</w:t>
+          <w:szCs w:val="21"/>
+        </w:rPr>
+        <w:t xml:space="preserve">｜8月4日</w:t>
       </w:r>
     </w:p>
     <w:p>
@@ -3241,7 +3202,15 @@
         <w:pStyle w:val="LessonQuestion"/>
       </w:pPr>
       <w:r>
-        <w:t>研究问题：看不见的空气有什么性质？怎样用实验留下证据？</w:t>
+        <w:rPr>
+          <w:b/>
+          <w:bCs/>
+          <w:color w:val="0B2545"/>
+        </w:rPr>
+        <w:t xml:space="preserve">研究问题：</w:t>
+      </w:r>
+      <w:r>
+        <w:t xml:space="preserve">空气有哪些性质？</w:t>
       </w:r>
     </w:p>
     <w:p>
@@ -3255,32 +3224,13 @@
       <w:r>
         <w:rPr>
           <w:b/>
-          <w:color w:val="0B2545"/>
-        </w:rPr>
-        <w:t>实验</w:t>
-      </w:r>
-      <w:r>
-        <w:rPr>
-          <w:b/>
-          <w:color w:val="0B2545"/>
-        </w:rPr>
-        <w:t xml:space="preserve"> 1</w:t>
-      </w:r>
-      <w:r>
-        <w:rPr>
-          <w:b/>
-          <w:color w:val="0B2545"/>
-        </w:rPr>
-        <w:t>｜杯中纸巾不湿：</w:t>
-      </w:r>
-      <w:r>
-        <w:t>把装有纸巾的杯子竖直倒扣入水，再倾斜杯子比较。空气占据空间（</w:t>
-      </w:r>
-      <w:r>
-        <w:t>takes up space</w:t>
-      </w:r>
-      <w:r>
-        <w:t>）；空气以气泡离开后，水才能进入。</w:t>
+          <w:bCs/>
+          <w:color w:val="0B2545"/>
+        </w:rPr>
+        <w:t xml:space="preserve">实验 1｜空气占据空间：</w:t>
+      </w:r>
+      <w:r>
+        <w:t xml:space="preserve">把纸巾放在杯底，杯子竖直倒扣进水中，纸巾没有变湿。杯内空气占据空间（takes up space），挡住了水。</w:t>
       </w:r>
     </w:p>
     <w:p>
@@ -3294,32 +3244,13 @@
       <w:r>
         <w:rPr>
           <w:b/>
-          <w:color w:val="0B2545"/>
-        </w:rPr>
-        <w:t>实验</w:t>
-      </w:r>
-      <w:r>
-        <w:rPr>
-          <w:b/>
-          <w:color w:val="0B2545"/>
-        </w:rPr>
-        <w:t xml:space="preserve"> 2</w:t>
-      </w:r>
-      <w:r>
-        <w:rPr>
-          <w:b/>
-          <w:color w:val="0B2545"/>
-        </w:rPr>
-        <w:t>｜气球天平：</w:t>
-      </w:r>
-      <w:r>
-        <w:t>先让两个未充气的气球平衡，再吹大其中一个，放回原位置比较。借助天平研究空气是否具有质量（</w:t>
-      </w:r>
-      <w:r>
-        <w:t>mass</w:t>
-      </w:r>
-      <w:r>
-        <w:t>）。</w:t>
+          <w:bCs/>
+          <w:color w:val="0B2545"/>
+        </w:rPr>
+        <w:t xml:space="preserve">实验 2｜空气具有质量：</w:t>
+      </w:r>
+      <w:r>
+        <w:t xml:space="preserve">衣架两端的气球原本平衡；吹大其中一个并挂回后，充气的一侧下沉，说明空气有质量（mass）。</w:t>
       </w:r>
     </w:p>
     <w:p>
@@ -3333,32 +3264,21 @@
       <w:r>
         <w:rPr>
           <w:b/>
-          <w:color w:val="0B2545"/>
-        </w:rPr>
-        <w:t>实验</w:t>
-      </w:r>
-      <w:r>
-        <w:rPr>
-          <w:b/>
-          <w:color w:val="0B2545"/>
-        </w:rPr>
-        <w:t xml:space="preserve"> 3</w:t>
-      </w:r>
-      <w:r>
-        <w:rPr>
-          <w:b/>
-          <w:color w:val="0B2545"/>
-        </w:rPr>
-        <w:t>｜倒扣水杯与卡片：</w:t>
-      </w:r>
-      <w:r>
-        <w:t>把装满水的杯子盖上卡片后倒转，观察卡片和水。大气压（</w:t>
-      </w:r>
-      <w:r>
-        <w:t>atmospheric pressure</w:t>
-      </w:r>
-      <w:r>
-        <w:t>）对卡片向上的作用可以托住水。</w:t>
+          <w:bCs/>
+          <w:color w:val="0B2545"/>
+        </w:rPr>
+        <w:t xml:space="preserve">实验 3｜大气压托住卡片：</w:t>
+      </w:r>
+      <w:r>
+        <w:t xml:space="preserve">将盖着卡片的满水杯倒扣，卡片和水没有掉落。外界大气压（atmospheric pressure）向上作用，托住了卡片和水。</w:t>
+      </w:r>
+    </w:p>
+    <w:p>
+      <w:r>
+        <w:rPr>
+          <w:color w:val="80627D"/>
+        </w:rPr>
+        <w:t xml:space="preserve">元宝觉得现象很神奇，又试了水没装满的杯子，发现水流了下来。杯口如果没有封严，空气进入后，内外气压差就托不住水。</w:t>
       </w:r>
     </w:p>
     <w:p>
@@ -3372,32 +3292,13 @@
       <w:r>
         <w:rPr>
           <w:b/>
-          <w:color w:val="0B2545"/>
-        </w:rPr>
-        <w:t>实验</w:t>
-      </w:r>
-      <w:r>
-        <w:rPr>
-          <w:b/>
-          <w:color w:val="0B2545"/>
-        </w:rPr>
-        <w:t xml:space="preserve"> 4</w:t>
-      </w:r>
-      <w:r>
-        <w:rPr>
-          <w:b/>
-          <w:color w:val="0B2545"/>
-        </w:rPr>
-        <w:t>｜冷却后压瘪塑料瓶：</w:t>
-      </w:r>
-      <w:r>
-        <w:t>用热水温暖瓶内气体，密封后冷却瓶身。瓶内压强降低，外界空气把瓶壁向内推，说明压强差（</w:t>
-      </w:r>
-      <w:r>
-        <w:t>pressure difference</w:t>
-      </w:r>
-      <w:r>
-        <w:t>）能产生力。</w:t>
+          <w:bCs/>
+          <w:color w:val="0B2545"/>
+        </w:rPr>
+        <w:t xml:space="preserve">实验 4｜气压差使瓶壁变形：</w:t>
+      </w:r>
+      <w:r>
+        <w:t xml:space="preserve">将装有热水的塑料瓶密封、冷却，观察瓶壁变瘪。瓶内气体冷却，部分水蒸气凝结，内外形成压强差（pressure difference），外界空气把瓶壁向内压瘪。</w:t>
       </w:r>
     </w:p>
     <w:p>
@@ -3411,32 +3312,13 @@
       <w:r>
         <w:rPr>
           <w:b/>
-          <w:color w:val="0B2545"/>
-        </w:rPr>
-        <w:t>实验</w:t>
-      </w:r>
-      <w:r>
-        <w:rPr>
-          <w:b/>
-          <w:color w:val="0B2545"/>
-        </w:rPr>
-        <w:t xml:space="preserve"> 5</w:t>
-      </w:r>
-      <w:r>
-        <w:rPr>
-          <w:b/>
-          <w:color w:val="0B2545"/>
-        </w:rPr>
-        <w:t>｜让纸机翼升起：</w:t>
-      </w:r>
-      <w:r>
-        <w:t>制作弧形纸翼，用吹风机吹过翼面，观察纸翼在线绳上的运动。翼面周围不均匀的压力和气流偏转能形成升力（</w:t>
-      </w:r>
-      <w:r>
-        <w:t>lift</w:t>
-      </w:r>
-      <w:r>
-        <w:t>）。</w:t>
+          <w:bCs/>
+          <w:color w:val="0B2545"/>
+        </w:rPr>
+        <w:t xml:space="preserve">实验 5｜气流产生升力：</w:t>
+      </w:r>
+      <w:r>
+        <w:t xml:space="preserve">用吹风机吹过弧形纸翼，观察它会升起。机翼周围的压力不均、气流方向改变，共同产生向上的升力（lift）。</w:t>
       </w:r>
     </w:p>
     <w:p>
@@ -3450,32 +3332,29 @@
       <w:r>
         <w:rPr>
           <w:b/>
-          <w:color w:val="0B2545"/>
-        </w:rPr>
-        <w:t>实验</w:t>
-      </w:r>
-      <w:r>
-        <w:rPr>
-          <w:b/>
-          <w:color w:val="0B2545"/>
-        </w:rPr>
-        <w:t xml:space="preserve"> 6</w:t>
-      </w:r>
-      <w:r>
-        <w:rPr>
-          <w:b/>
-          <w:color w:val="0B2545"/>
-        </w:rPr>
-        <w:t>｜蜡烛罩杯：</w:t>
-      </w:r>
-      <w:r>
-        <w:t>用玻璃罐罩住水盘里的蜡烛，观察火焰与水位。氧气（</w:t>
-      </w:r>
-      <w:r>
-        <w:t>oxygen</w:t>
-      </w:r>
-      <w:r>
-        <w:t>）支持燃烧；罩杯后可用氧气减少，冷却等因素又使罐内压强降低。水位变化不能直接当作氧气所占比例。</w:t>
+          <w:bCs/>
+          <w:color w:val="0B2545"/>
+        </w:rPr>
+        <w:t xml:space="preserve">实验 6｜空气中含有氧气：</w:t>
+      </w:r>
+      <w:r>
+        <w:t xml:space="preserve">把燃着的蜡烛放在水盘里，用透明罩倒扣住，罩口浸在水中。预期火焰熄灭、罩内水面上升：蜡烛消耗罩内氧气（oxygen），内压下降，外界空气把水推入罩内。</w:t>
+      </w:r>
+    </w:p>
+    <w:p>
+      <w:pPr>
+        <w:pStyle w:val="SchoolAlignment"/>
+        <w:pBdr>
+          <w:left w:val="single" w:sz="6" w:space="7" w:color="C2AD88"/>
+        </w:pBdr>
+        <w:shd w:val="clear" w:color="auto" w:fill="F8F4EC"/>
+        <w:ind w:left="230" w:right="144"/>
+      </w:pPr>
+      <w:r>
+        <w:rPr>
+          <w:color w:val="333333"/>
+        </w:rPr>
+        <w:t xml:space="preserve">这个实验蜡烛熄灭了，但水面没有观察到明显变化。可能因为水盆大且浅，罩子浮在水面上密封不严，蜡烛很浅且所剩不多。换合适的水盆、罩子和蜡烛后可以重新尝试。</w:t>
       </w:r>
     </w:p>
     <w:p>
@@ -3489,38 +3368,304 @@
       <w:r>
         <w:rPr>
           <w:b/>
-          <w:color w:val="0B2545"/>
-        </w:rPr>
-        <w:t>实验</w:t>
-      </w:r>
-      <w:r>
-        <w:rPr>
-          <w:b/>
-          <w:color w:val="0B2545"/>
-        </w:rPr>
-        <w:t xml:space="preserve"> 7</w:t>
-      </w:r>
-      <w:r>
-        <w:rPr>
-          <w:b/>
-          <w:color w:val="0B2545"/>
-        </w:rPr>
-        <w:t>｜紫甘蓝显色与呼气对照：</w:t>
-      </w:r>
-      <w:r>
-        <w:t>用紫甘蓝汁比较糖水、柠檬汁、小苏打水、白醋、肥皂水和雪碧的颜色，再比较呼气组与空气对照。紫甘蓝是酸碱指示剂（</w:t>
-      </w:r>
-      <w:r>
-        <w:t>acid–base indicator</w:t>
-      </w:r>
-      <w:r>
-        <w:t>）；呼出的二氧化碳（</w:t>
-      </w:r>
-      <w:r>
-        <w:t>carbon dioxide</w:t>
-      </w:r>
-      <w:r>
-        <w:t>）溶于水后会使水偏酸。</w:t>
+          <w:bCs/>
+          <w:color w:val="0B2545"/>
+        </w:rPr>
+        <w:t xml:space="preserve">实验 7｜酸碱指示剂显示酸碱变化：</w:t>
+      </w:r>
+      <w:r>
+        <w:t xml:space="preserve">紫甘蓝汁是酸碱指示剂（acid–base indicator）：酸性时偏红或粉色，接近中性时偏紫色，碱性时偏蓝绿。</w:t>
+      </w:r>
+    </w:p>
+    <w:p>
+      <w:pPr>
+        <w:pStyle w:val="ParentBullet"/>
+        <w:numPr>
+          <w:ilvl w:val="1"/>
+          <w:numId w:val="1"/>
+        </w:numPr>
+      </w:pPr>
+      <w:r>
+        <w:rPr>
+          <w:b/>
+          <w:bCs/>
+          <w:color w:val="0B2545"/>
+        </w:rPr>
+        <w:t xml:space="preserve">液体对比：</w:t>
+      </w:r>
+      <w:r>
+        <w:t xml:space="preserve">用紫甘蓝汁比较五种液体。下表为预期颜色。</w:t>
+      </w:r>
+    </w:p>
+    <w:tbl>
+      <w:tblPr>
+        <w:tblW w:w="9360" w:type="dxa"/>
+        <w:tblInd w:w="120" w:type="dxa"/>
+        <w:tblBorders>
+          <w:top w:val="single" w:sz="6" w:space="0" w:color="D7DBE2"/>
+          <w:left w:val="single" w:sz="6" w:space="0" w:color="D7DBE2"/>
+          <w:bottom w:val="single" w:sz="6" w:space="0" w:color="D7DBE2"/>
+          <w:right w:val="single" w:sz="6" w:space="0" w:color="D7DBE2"/>
+          <w:insideH w:val="single" w:sz="6" w:space="0" w:color="D7DBE2"/>
+          <w:insideV w:val="single" w:sz="6" w:space="0" w:color="D7DBE2"/>
+        </w:tblBorders>
+        <w:tblLayout w:type="fixed"/>
+        <w:tblCellMar>
+          <w:top w:w="80" w:type="dxa"/>
+          <w:left w:w="120" w:type="dxa"/>
+          <w:bottom w:w="80" w:type="dxa"/>
+          <w:right w:w="120" w:type="dxa"/>
+        </w:tblCellMar>
+        <w:tblLook w:val="0000" w:firstRow="0" w:lastRow="0" w:firstColumn="0" w:lastColumn="0" w:noHBand="0" w:noVBand="0"/>
+      </w:tblPr>
+      <w:tblGrid>
+        <w:gridCol w:w="1872"/>
+        <w:gridCol w:w="1872"/>
+        <w:gridCol w:w="1872"/>
+        <w:gridCol w:w="1872"/>
+        <w:gridCol w:w="1872"/>
+      </w:tblGrid>
+      <w:tr>
+        <w:trPr>
+          <w:cantSplit/>
+          <w:tblHeader/>
+        </w:trPr>
+        <w:tc>
+          <w:tcPr>
+            <w:tcW w:w="1872" w:type="dxa"/>
+            <w:shd w:val="clear" w:color="auto" w:fill="F2F4F7"/>
+            <w:vAlign w:val="center"/>
+          </w:tcPr>
+          <w:p>
+            <w:pPr>
+              <w:pStyle w:val="TableText"/>
+              <w:jc w:val="center"/>
+            </w:pPr>
+            <w:r>
+              <w:rPr>
+                <w:b/>
+                <w:bCs/>
+                <w:color w:val="0B2545"/>
+              </w:rPr>
+              <w:t xml:space="preserve">糖水</w:t>
+            </w:r>
+          </w:p>
+        </w:tc>
+        <w:tc>
+          <w:tcPr>
+            <w:tcW w:w="1872" w:type="dxa"/>
+            <w:shd w:val="clear" w:color="auto" w:fill="F2F4F7"/>
+            <w:vAlign w:val="center"/>
+          </w:tcPr>
+          <w:p>
+            <w:pPr>
+              <w:pStyle w:val="TableText"/>
+              <w:jc w:val="center"/>
+            </w:pPr>
+            <w:r>
+              <w:rPr>
+                <w:b/>
+                <w:bCs/>
+                <w:color w:val="0B2545"/>
+              </w:rPr>
+              <w:t xml:space="preserve">小苏打水</w:t>
+            </w:r>
+          </w:p>
+        </w:tc>
+        <w:tc>
+          <w:tcPr>
+            <w:tcW w:w="1872" w:type="dxa"/>
+            <w:shd w:val="clear" w:color="auto" w:fill="F2F4F7"/>
+            <w:vAlign w:val="center"/>
+          </w:tcPr>
+          <w:p>
+            <w:pPr>
+              <w:pStyle w:val="TableText"/>
+              <w:jc w:val="center"/>
+            </w:pPr>
+            <w:r>
+              <w:rPr>
+                <w:b/>
+                <w:bCs/>
+                <w:color w:val="0B2545"/>
+              </w:rPr>
+              <w:t xml:space="preserve">白醋</w:t>
+            </w:r>
+          </w:p>
+        </w:tc>
+        <w:tc>
+          <w:tcPr>
+            <w:tcW w:w="1872" w:type="dxa"/>
+            <w:shd w:val="clear" w:color="auto" w:fill="F2F4F7"/>
+            <w:vAlign w:val="center"/>
+          </w:tcPr>
+          <w:p>
+            <w:pPr>
+              <w:pStyle w:val="TableText"/>
+              <w:jc w:val="center"/>
+            </w:pPr>
+            <w:r>
+              <w:rPr>
+                <w:b/>
+                <w:bCs/>
+                <w:color w:val="0B2545"/>
+              </w:rPr>
+              <w:t xml:space="preserve">肥皂水</w:t>
+            </w:r>
+          </w:p>
+        </w:tc>
+        <w:tc>
+          <w:tcPr>
+            <w:tcW w:w="1872" w:type="dxa"/>
+            <w:shd w:val="clear" w:color="auto" w:fill="F2F4F7"/>
+            <w:vAlign w:val="center"/>
+          </w:tcPr>
+          <w:p>
+            <w:pPr>
+              <w:pStyle w:val="TableText"/>
+              <w:jc w:val="center"/>
+            </w:pPr>
+            <w:r>
+              <w:rPr>
+                <w:b/>
+                <w:bCs/>
+                <w:color w:val="0B2545"/>
+              </w:rPr>
+              <w:t xml:space="preserve">雪碧</w:t>
+            </w:r>
+          </w:p>
+        </w:tc>
+      </w:tr>
+      <w:tr>
+        <w:trPr>
+          <w:cantSplit/>
+        </w:trPr>
+        <w:tc>
+          <w:tcPr>
+            <w:tcW w:w="1872" w:type="dxa"/>
+            <w:vAlign w:val="center"/>
+          </w:tcPr>
+          <w:p>
+            <w:pPr>
+              <w:pStyle w:val="TableText"/>
+            </w:pPr>
+            <w:r>
+              <w:t xml:space="preserve">接近紫色</w:t>
+            </w:r>
+          </w:p>
+        </w:tc>
+        <w:tc>
+          <w:tcPr>
+            <w:tcW w:w="1872" w:type="dxa"/>
+            <w:vAlign w:val="center"/>
+          </w:tcPr>
+          <w:p>
+            <w:pPr>
+              <w:pStyle w:val="TableText"/>
+            </w:pPr>
+            <w:r>
+              <w:t xml:space="preserve">蓝或蓝绿</w:t>
+            </w:r>
+          </w:p>
+        </w:tc>
+        <w:tc>
+          <w:tcPr>
+            <w:tcW w:w="1872" w:type="dxa"/>
+            <w:vAlign w:val="center"/>
+          </w:tcPr>
+          <w:p>
+            <w:pPr>
+              <w:pStyle w:val="TableText"/>
+            </w:pPr>
+            <w:r>
+              <w:t xml:space="preserve">红或粉紫</w:t>
+            </w:r>
+          </w:p>
+        </w:tc>
+        <w:tc>
+          <w:tcPr>
+            <w:tcW w:w="1872" w:type="dxa"/>
+            <w:vAlign w:val="center"/>
+          </w:tcPr>
+          <w:p>
+            <w:pPr>
+              <w:pStyle w:val="TableText"/>
+            </w:pPr>
+            <w:r>
+              <w:t xml:space="preserve">蓝绿或绿</w:t>
+            </w:r>
+          </w:p>
+        </w:tc>
+        <w:tc>
+          <w:tcPr>
+            <w:tcW w:w="1872" w:type="dxa"/>
+            <w:vAlign w:val="center"/>
+          </w:tcPr>
+          <w:p>
+            <w:pPr>
+              <w:pStyle w:val="TableText"/>
+            </w:pPr>
+            <w:r>
+              <w:t xml:space="preserve">红或粉紫</w:t>
+            </w:r>
+          </w:p>
+        </w:tc>
+      </w:tr>
+    </w:tbl>
+    <w:p>
+      <w:pPr>
+        <w:pStyle w:val="ParentBullet"/>
+        <w:numPr>
+          <w:ilvl w:val="1"/>
+          <w:numId w:val="1"/>
+        </w:numPr>
+      </w:pPr>
+      <w:r>
+        <w:rPr>
+          <w:b/>
+          <w:bCs/>
+          <w:color w:val="0B2545"/>
+        </w:rPr>
+        <w:t xml:space="preserve">呼气对照：</w:t>
+      </w:r>
+      <w:r>
+        <w:t xml:space="preserve">向一杯紫甘蓝汁中吹气，呼出的二氧化碳（carbon dioxide）溶于水，使水偏酸，在指示剂下变粉红。</w:t>
+      </w:r>
+    </w:p>
+    <w:p>
+      <w:pPr>
+        <w:pStyle w:val="SchoolAlignment"/>
+        <w:pBdr>
+          <w:left w:val="single" w:sz="6" w:space="7" w:color="C2AD88"/>
+        </w:pBdr>
+        <w:shd w:val="clear" w:color="auto" w:fill="F8F4EC"/>
+        <w:ind w:left="230" w:right="144"/>
+      </w:pPr>
+      <w:r>
+        <w:rPr>
+          <w:color w:val="333333"/>
+        </w:rPr>
+        <w:t xml:space="preserve">这次只看到一点点颜色变化，变浅红紫，变化不太明显。</w:t>
+      </w:r>
+    </w:p>
+    <w:p>
+      <w:pPr>
+        <w:pStyle w:val="KnowledgeSummary"/>
+        <w:rPr>
+          <w:b/>
+          <w:bCs/>
+        </w:rPr>
+      </w:pPr>
+      <w:r>
+        <w:rPr>
+          <w:b/>
+          <w:bCs/>
+          <w:color w:val="0B2545"/>
+        </w:rPr>
+        <w:t xml:space="preserve">小结：</w:t>
+      </w:r>
+      <w:r>
+        <w:t xml:space="preserve">空气占据空间、有质量，也能对物体施加压力。空气是多种气体组成的均一混合物（homogeneous mixture），其中氧气支持燃烧。</w:t>
       </w:r>
     </w:p>
     <w:p>
@@ -3535,35 +3680,16 @@
       <w:r>
         <w:rPr>
           <w:b/>
-          <w:color w:val="0B2545"/>
-        </w:rPr>
-        <w:lastRenderedPageBreak/>
-        <w:t xml:space="preserve">School </w:t>
-      </w:r>
-      <w:r>
-        <w:rPr>
-          <w:b/>
-          <w:color w:val="0B2545"/>
-        </w:rPr>
-        <w:t>对应｜</w:t>
-      </w:r>
-      <w:r>
-        <w:t>Unit 2 — Notes 01 Phases of Matter</w:t>
-      </w:r>
-      <w:r>
-        <w:t>、</w:t>
-      </w:r>
-      <w:r>
-        <w:t>Notes 02 Mixtures and Solutions</w:t>
-      </w:r>
-      <w:r>
-        <w:t>：空气有质量、占空间，也是混合物。</w:t>
-      </w:r>
-      <w:r>
-        <w:t>Unit 4 — Notes 10 Respiratory System</w:t>
-      </w:r>
-      <w:r>
-        <w:t>：联系吸入氧气、呼出二氧化碳；未覆盖整套呼吸器官与呼吸机制。</w:t>
+          <w:bCs/>
+          <w:color w:val="0B2545"/>
+        </w:rPr>
+        <w:t xml:space="preserve">School 对应｜</w:t>
+      </w:r>
+      <w:r>
+        <w:rPr>
+          <w:color w:val="0B2545"/>
+        </w:rPr>
+        <w:t xml:space="preserve">Unit 2 — Notes 01 Phases of Matter、Notes 02 Mixtures and Solutions：空气的性质与混合物；Unit 4 — Notes 10 Respiratory System：联系吸入氧气、呼出二氧化碳。</w:t>
       </w:r>
     </w:p>
     <w:p>
@@ -3571,43 +3697,14 @@
         <w:pStyle w:val="2"/>
       </w:pPr>
       <w:r>
-        <w:t>第</w:t>
-      </w:r>
-      <w:r>
-        <w:t xml:space="preserve"> 8 </w:t>
-      </w:r>
-      <w:r>
-        <w:t>次课｜显微镜下的细胞</w:t>
+        <w:t xml:space="preserve">第 8 次课｜显微镜下的细胞</w:t>
       </w:r>
       <w:r>
         <w:rPr>
           <w:sz w:val="21"/>
-        </w:rPr>
-        <w:t>｜</w:t>
-      </w:r>
-      <w:r>
-        <w:rPr>
-          <w:sz w:val="21"/>
-        </w:rPr>
-        <w:t>8</w:t>
-      </w:r>
-      <w:r>
-        <w:rPr>
-          <w:sz w:val="21"/>
-        </w:rPr>
-        <w:t>月</w:t>
-      </w:r>
-      <w:r>
-        <w:rPr>
-          <w:sz w:val="21"/>
-        </w:rPr>
-        <w:t>11</w:t>
-      </w:r>
-      <w:r>
-        <w:rPr>
-          <w:sz w:val="21"/>
-        </w:rPr>
-        <w:t>日</w:t>
+          <w:szCs w:val="21"/>
+        </w:rPr>
+        <w:t xml:space="preserve">｜8月11日</w:t>
       </w:r>
     </w:p>
     <w:p>
@@ -3615,7 +3712,35 @@
         <w:pStyle w:val="LessonQuestion"/>
       </w:pPr>
       <w:r>
-        <w:t>研究问题：植物细胞和动物细胞有什么不同？细胞里的水会怎样移动？</w:t>
+        <w:rPr>
+          <w:b/>
+          <w:bCs/>
+          <w:color w:val="0B2545"/>
+        </w:rPr>
+        <w:t xml:space="preserve">研究问题：</w:t>
+      </w:r>
+      <w:r>
+        <w:t xml:space="preserve">细胞有哪些结构和功能？</w:t>
+      </w:r>
+    </w:p>
+    <w:p>
+      <w:r>
+        <w:rPr>
+          <w:b/>
+          <w:bCs/>
+        </w:rPr>
+        <w:t xml:space="preserve">装片制作：</w:t>
+      </w:r>
+      <w:r>
+        <w:t xml:space="preserve">在洋葱鳞片内侧划出约 5 毫米见方的小口，从边缘撕下一小片透明表皮，铺平在载玻片的水滴中，再盖上盖玻片。染色时，从盖玻片一侧滴入染液，用纸从另一侧吸引。</w:t>
+      </w:r>
+    </w:p>
+    <w:p>
+      <w:r>
+        <w:rPr>
+          <w:color w:val="80627D"/>
+        </w:rPr>
+        <w:t xml:space="preserve">元宝很喜欢装片，接连做了三四张洋葱表皮片。她自己摸索出染色方法，每次效果都很好。元宝还当场拍死了一只小虫做成装片观察。</w:t>
       </w:r>
     </w:p>
     <w:p>
@@ -3629,44 +3754,13 @@
       <w:r>
         <w:rPr>
           <w:b/>
-          <w:color w:val="0B2545"/>
-        </w:rPr>
-        <w:t>实验</w:t>
-      </w:r>
-      <w:r>
-        <w:rPr>
-          <w:b/>
-          <w:color w:val="0B2545"/>
-        </w:rPr>
-        <w:t xml:space="preserve"> 1</w:t>
-      </w:r>
-      <w:r>
-        <w:rPr>
-          <w:b/>
-          <w:color w:val="0B2545"/>
-        </w:rPr>
-        <w:t>｜洋葱表皮细胞：</w:t>
-      </w:r>
-      <w:r>
-        <w:t>制作洋葱内表皮装片，用显微镜（</w:t>
-      </w:r>
-      <w:r>
-        <w:t>microscope</w:t>
-      </w:r>
-      <w:r>
-        <w:t>）观察、绘图和标注。借助细胞壁（</w:t>
-      </w:r>
-      <w:r>
-        <w:t>cell wall</w:t>
-      </w:r>
-      <w:r>
-        <w:t>）、细胞核（</w:t>
-      </w:r>
-      <w:r>
-        <w:t>nucleus</w:t>
-      </w:r>
-      <w:r>
-        <w:t>）等结构，认识植物细胞。</w:t>
+          <w:bCs/>
+          <w:color w:val="0B2545"/>
+        </w:rPr>
+        <w:t xml:space="preserve">实验 1｜观察洋葱表皮细胞：</w:t>
+      </w:r>
+      <w:r>
+        <w:t xml:space="preserve">显微镜（microscope）下可见排列整齐的方格状细胞；清楚的边界主要是细胞壁（cell wall）。</w:t>
       </w:r>
     </w:p>
     <w:p>
@@ -3680,38 +3774,29 @@
       <w:r>
         <w:rPr>
           <w:b/>
-          <w:color w:val="0B2545"/>
-        </w:rPr>
-        <w:t>实验</w:t>
-      </w:r>
-      <w:r>
-        <w:rPr>
-          <w:b/>
-          <w:color w:val="0B2545"/>
-        </w:rPr>
-        <w:t xml:space="preserve"> 2</w:t>
-      </w:r>
-      <w:r>
-        <w:rPr>
-          <w:b/>
-          <w:color w:val="0B2545"/>
-        </w:rPr>
-        <w:t>｜口腔上皮细胞：</w:t>
-      </w:r>
-      <w:r>
-        <w:t>制作口腔上皮装片，与洋葱表皮的观察图比较。动物细胞没有细胞壁；结合图像讲解细胞膜（</w:t>
-      </w:r>
-      <w:r>
-        <w:t>cell membrane</w:t>
-      </w:r>
-      <w:r>
-        <w:t>）、细胞质（</w:t>
-      </w:r>
-      <w:r>
-        <w:t>cytoplasm</w:t>
-      </w:r>
-      <w:r>
-        <w:t>）和细胞核的功能。只把实际分辨出的结构画进观察图。</w:t>
+          <w:bCs/>
+          <w:color w:val="0B2545"/>
+        </w:rPr>
+        <w:t xml:space="preserve">实验 2｜口腔上皮细胞：</w:t>
+      </w:r>
+      <w:r>
+        <w:t xml:space="preserve">原计划制作口腔上皮装片，与洋葱表皮细胞比较，观察动物细胞和植物细胞的差异。</w:t>
+      </w:r>
+    </w:p>
+    <w:p>
+      <w:pPr>
+        <w:pStyle w:val="SchoolAlignment"/>
+        <w:pBdr>
+          <w:left w:val="single" w:sz="6" w:space="7" w:color="C2AD88"/>
+        </w:pBdr>
+        <w:shd w:val="clear" w:color="auto" w:fill="F8F4EC"/>
+        <w:ind w:left="230" w:right="144"/>
+      </w:pPr>
+      <w:r>
+        <w:rPr>
+          <w:color w:val="333333"/>
+        </w:rPr>
+        <w:t xml:space="preserve">课堂上先后用棉签和牙签取样。棉签沾水后吸水，细胞难以转移到玻片上；牙签也没能做出可观察的装片。因此最后没有观察到口腔上皮细胞，但我们画了示意图比较动植物细胞。</w:t>
       </w:r>
     </w:p>
     <w:p>
@@ -3725,38 +3810,18 @@
       <w:r>
         <w:rPr>
           <w:b/>
-          <w:color w:val="0B2545"/>
-        </w:rPr>
-        <w:t>实验</w:t>
-      </w:r>
-      <w:r>
-        <w:rPr>
-          <w:b/>
-          <w:color w:val="0B2545"/>
-        </w:rPr>
-        <w:t xml:space="preserve"> 3</w:t>
-      </w:r>
-      <w:r>
-        <w:rPr>
-          <w:b/>
-          <w:color w:val="0B2545"/>
-        </w:rPr>
-        <w:t>｜红洋葱质壁分离：</w:t>
-      </w:r>
-      <w:r>
-        <w:t>在同一组细胞中比较加入盐水前后的状态，观察有色内容物是否缩离细胞壁。水通过细胞膜向外移动，液泡缩小，称为渗透作用（</w:t>
-      </w:r>
-      <w:r>
-        <w:t>osmosis</w:t>
-      </w:r>
-      <w:r>
-        <w:t>）；由此出现的分离现象叫质壁分离（</w:t>
-      </w:r>
-      <w:r>
-        <w:t>plasmolysis</w:t>
-      </w:r>
-      <w:r>
-        <w:t>）。</w:t>
+          <w:bCs/>
+          <w:color w:val="0B2545"/>
+        </w:rPr>
+        <w:t xml:space="preserve">实验 3｜洋葱质壁分离及复原：</w:t>
+      </w:r>
+      <w:r>
+        <w:t xml:space="preserve">让盐水进入洋葱装片，我们可以看到有色内容物缩离细胞壁；这是细胞因渗透作用（osmosis）失水后发生的质壁分离（plasmolysis）。随后多次从一侧滴入清水、另一侧吸走盐水，继续观察同一组细胞，有色内容物重新贴近细胞壁。</w:t>
+      </w:r>
+    </w:p>
+    <w:p>
+      <w:r>
+        <w:t xml:space="preserve">这几个实验围绕细胞的结构与功能：洋葱片看见细胞壁（cell wall），质壁分离结合模型区分细胞壁与细胞膜（cell membrane）。细胞膜控制物质进出，细胞核（nucleus）控制细胞活动。</w:t>
       </w:r>
     </w:p>
     <w:p>
@@ -3770,56 +3835,25 @@
       <w:r>
         <w:rPr>
           <w:b/>
-          <w:color w:val="0B2545"/>
-        </w:rPr>
-        <w:t>实验</w:t>
-      </w:r>
-      <w:r>
-        <w:rPr>
-          <w:b/>
-          <w:color w:val="0B2545"/>
-        </w:rPr>
-        <w:t xml:space="preserve"> 4</w:t>
-      </w:r>
-      <w:r>
-        <w:rPr>
-          <w:b/>
-          <w:color w:val="0B2545"/>
-        </w:rPr>
-        <w:t>｜杯壁种豆：</w:t>
-      </w:r>
-      <w:r>
-        <w:t>把豆子放在纸巾与透明杯壁之间，设置湿润与干燥条件，启动种子萌发（</w:t>
-      </w:r>
-      <w:r>
-        <w:t>germination</w:t>
-      </w:r>
-      <w:r>
-        <w:t>）观察。比较是否萌发和根长，练习长期记录。</w:t>
-      </w:r>
-    </w:p>
-    <w:p>
-      <w:pPr>
-        <w:pStyle w:val="SchoolAlignment"/>
-        <w:pBdr>
-          <w:left w:val="single" w:sz="16" w:space="7" w:color="C2AD88"/>
-        </w:pBdr>
-        <w:shd w:val="clear" w:color="auto" w:fill="F8F4EC"/>
-        <w:ind w:left="230" w:right="144"/>
-      </w:pPr>
-      <w:r>
-        <w:t>两次课间隔约两周，豆苗缺少持续照料，后来死亡。没有连续观察记录，不能据此确定唯一原因。</w:t>
-      </w:r>
-    </w:p>
-    <w:p>
-      <w:r>
-        <w:t>细胞学说（</w:t>
-      </w:r>
-      <w:r>
-        <w:t>cell theory</w:t>
-      </w:r>
-      <w:r>
-        <w:t>）：生物由细胞组成；细胞是生命的基本单位；新细胞来自已有细胞。</w:t>
+          <w:bCs/>
+          <w:color w:val="0B2545"/>
+        </w:rPr>
+        <w:t xml:space="preserve">实验 4｜观察绿豆萌发：</w:t>
+      </w:r>
+      <w:r>
+        <w:t xml:space="preserve">四杯都保持湿润。元宝做的两杯把绿豆放在杯底纸巾上；我做的两杯放在杯壁旁，一杯罩起来遮光，一杯见光。后来绿豆都发了芽，说明绿豆萌发（germination）初期可以在黑暗中长根。</w:t>
+      </w:r>
+    </w:p>
+    <w:p>
+      <w:r>
+        <w:rPr>
+          <w:b/>
+          <w:bCs/>
+        </w:rPr>
+        <w:t xml:space="preserve">细胞学说（cell theory）：</w:t>
+      </w:r>
+      <w:r>
+        <w:t xml:space="preserve">生物由细胞组成；细胞是生命的基本单位；新细胞来自已有细胞。</w:t>
       </w:r>
     </w:p>
     <w:p>
@@ -3834,40 +3868,16 @@
       <w:r>
         <w:rPr>
           <w:b/>
-          <w:color w:val="0B2545"/>
-        </w:rPr>
-        <w:t xml:space="preserve">School </w:t>
-      </w:r>
-      <w:r>
-        <w:rPr>
-          <w:b/>
-          <w:color w:val="0B2545"/>
-        </w:rPr>
-        <w:t>对应｜</w:t>
-      </w:r>
-      <w:r>
-        <w:t>Unit 4 — Notes 01 Characteristics of Living Things</w:t>
-      </w:r>
-      <w:r>
-        <w:t>、</w:t>
-      </w:r>
-      <w:r>
-        <w:t>Notes 02 Cell Structure</w:t>
-      </w:r>
-      <w:r>
-        <w:t>、</w:t>
-      </w:r>
-      <w:r>
-        <w:t>Notes 03 Cell Supplementary</w:t>
-      </w:r>
-      <w:r>
-        <w:t>，以及</w:t>
-      </w:r>
-      <w:r>
-        <w:t xml:space="preserve"> Homework 02 Cell Vocabulary</w:t>
-      </w:r>
-      <w:r>
-        <w:t>。重点为细胞结构与功能、动植物细胞差异和细胞学说；质壁分离是观察细胞失水的实验拓展。</w:t>
+          <w:bCs/>
+          <w:color w:val="0B2545"/>
+        </w:rPr>
+        <w:t xml:space="preserve">School 对应｜</w:t>
+      </w:r>
+      <w:r>
+        <w:rPr>
+          <w:color w:val="0B2545"/>
+        </w:rPr>
+        <w:t xml:space="preserve">Unit 4 — Notes 01 Characteristics of Living Things、Notes 02 Cell Structure、Notes 03 Cell Supplementary，以及 Homework 02 Cell Vocabulary：细胞结构与功能、动植物细胞差异和细胞学说。</w:t>
       </w:r>
     </w:p>
     <w:p>
@@ -3875,43 +3885,14 @@
         <w:pStyle w:val="2"/>
       </w:pPr>
       <w:r>
-        <w:t>第</w:t>
-      </w:r>
-      <w:r>
-        <w:t xml:space="preserve"> 9 </w:t>
-      </w:r>
-      <w:r>
-        <w:t>次课｜植物怎样运输水和糖？</w:t>
+        <w:t xml:space="preserve">第 9 次课｜植物怎样运输水？</w:t>
       </w:r>
       <w:r>
         <w:rPr>
           <w:sz w:val="21"/>
-        </w:rPr>
-        <w:t>｜</w:t>
-      </w:r>
-      <w:r>
-        <w:rPr>
-          <w:sz w:val="21"/>
-        </w:rPr>
-        <w:t>8</w:t>
-      </w:r>
-      <w:r>
-        <w:rPr>
-          <w:sz w:val="21"/>
-        </w:rPr>
-        <w:t>月</w:t>
-      </w:r>
-      <w:r>
-        <w:rPr>
-          <w:sz w:val="21"/>
-        </w:rPr>
-        <w:t>25</w:t>
-      </w:r>
-      <w:r>
-        <w:rPr>
-          <w:sz w:val="21"/>
-        </w:rPr>
-        <w:t>日</w:t>
+          <w:szCs w:val="21"/>
+        </w:rPr>
+        <w:t xml:space="preserve">｜8月25日</w:t>
       </w:r>
     </w:p>
     <w:p>
@@ -3919,7 +3900,15 @@
         <w:pStyle w:val="LessonQuestion"/>
       </w:pPr>
       <w:r>
-        <w:t>研究问题：水怎样到达叶片？叶片制造的糖怎样送到其他部位？</w:t>
+        <w:rPr>
+          <w:b/>
+          <w:bCs/>
+          <w:color w:val="0B2545"/>
+        </w:rPr>
+        <w:t xml:space="preserve">研究问题：</w:t>
+      </w:r>
+      <w:r>
+        <w:t xml:space="preserve">植物怎样运输水？</w:t>
       </w:r>
     </w:p>
     <w:p>
@@ -3933,38 +3922,29 @@
       <w:r>
         <w:rPr>
           <w:b/>
-          <w:color w:val="0B2545"/>
-        </w:rPr>
-        <w:t>实验</w:t>
-      </w:r>
-      <w:r>
-        <w:rPr>
-          <w:b/>
-          <w:color w:val="0B2545"/>
-        </w:rPr>
-        <w:t xml:space="preserve"> 1</w:t>
-      </w:r>
-      <w:r>
-        <w:rPr>
-          <w:b/>
-          <w:color w:val="0B2545"/>
-        </w:rPr>
-        <w:t>｜西芹与白花染色：</w:t>
-      </w:r>
-      <w:r>
-        <w:t>把西芹和白花插入有色水，用色素追踪水经过的路线。分别观察西芹横切面的点状区域、纵切面的线条，再用显微镜寻找维管束（</w:t>
-      </w:r>
-      <w:r>
-        <w:t>vascular bundles</w:t>
-      </w:r>
-      <w:r>
-        <w:t>）。木质部（</w:t>
-      </w:r>
-      <w:r>
-        <w:t>xylem</w:t>
-      </w:r>
-      <w:r>
-        <w:t>）负责运输水和矿物质。</w:t>
+          <w:bCs/>
+          <w:color w:val="0B2545"/>
+        </w:rPr>
+        <w:t xml:space="preserve">实验 1｜西芹与白花染色：</w:t>
+      </w:r>
+      <w:r>
+        <w:t xml:space="preserve">观察提前染色的西芹，切面上清楚看到蓝色的维管束（vascular bundles）；再做薄片，用显微镜观察蓝色束区。蓝色显示水沿木质部（xylem）向上运输。将白色康乃馨放入染色水，观察花瓣是否变色。</w:t>
+      </w:r>
+    </w:p>
+    <w:p>
+      <w:pPr>
+        <w:pStyle w:val="SchoolAlignment"/>
+        <w:pBdr>
+          <w:left w:val="single" w:sz="6" w:space="7" w:color="C2AD88"/>
+        </w:pBdr>
+        <w:shd w:val="clear" w:color="auto" w:fill="F8F4EC"/>
+        <w:ind w:left="230" w:right="144"/>
+      </w:pPr>
+      <w:r>
+        <w:rPr>
+          <w:color w:val="80627D"/>
+        </w:rPr>
+        <w:t xml:space="preserve">元宝用红、绿两种染色水给白花染色。下周上课时，整朵花都染上了颜色。</w:t>
       </w:r>
     </w:p>
     <w:p>
@@ -3978,33 +3958,13 @@
       <w:r>
         <w:rPr>
           <w:b/>
-          <w:color w:val="0B2545"/>
-        </w:rPr>
-        <w:lastRenderedPageBreak/>
-        <w:t>实验</w:t>
-      </w:r>
-      <w:r>
-        <w:rPr>
-          <w:b/>
-          <w:color w:val="0B2545"/>
-        </w:rPr>
-        <w:t xml:space="preserve"> 2</w:t>
-      </w:r>
-      <w:r>
-        <w:rPr>
-          <w:b/>
-          <w:color w:val="0B2545"/>
-        </w:rPr>
-        <w:t>｜叶片气孔观察：</w:t>
-      </w:r>
-      <w:r>
-        <w:t>制作薄叶装片，比较叶片上、下表面，寻找气孔（</w:t>
-      </w:r>
-      <w:r>
-        <w:t>stomata</w:t>
-      </w:r>
-      <w:r>
-        <w:t>）。气孔是气体进出的开口，也是叶片散失水蒸气的主要通道。</w:t>
+          <w:bCs/>
+          <w:color w:val="0B2545"/>
+        </w:rPr>
+        <w:t xml:space="preserve">实验 2｜叶片气孔观察：</w:t>
+      </w:r>
+      <w:r>
+        <w:t xml:space="preserve">制作叶片上、下表面的装片，用显微镜寻找气孔（stomata）。气孔是叶片上供气体进出、水蒸气散失的小开口。</w:t>
       </w:r>
     </w:p>
     <w:p>
@@ -4018,32 +3978,49 @@
       <w:r>
         <w:rPr>
           <w:b/>
-          <w:color w:val="0B2545"/>
-        </w:rPr>
-        <w:t>实验</w:t>
-      </w:r>
-      <w:r>
-        <w:rPr>
-          <w:b/>
-          <w:color w:val="0B2545"/>
-        </w:rPr>
-        <w:t xml:space="preserve"> 3</w:t>
-      </w:r>
-      <w:r>
-        <w:rPr>
-          <w:b/>
-          <w:color w:val="0B2545"/>
-        </w:rPr>
-        <w:t>｜蒸腾套袋对照：</w:t>
-      </w:r>
-      <w:r>
-        <w:t>用干燥透明袋套住叶片，旁边放空袋作对照，比较雾气与水滴。叶片散失水蒸气的过程叫蒸腾作用（</w:t>
-      </w:r>
-      <w:r>
-        <w:t>transpiration</w:t>
-      </w:r>
-      <w:r>
-        <w:t>），能帮助水沿木质部向上运输。染色与套袋的变化可延续到课后观察。</w:t>
+          <w:bCs/>
+          <w:color w:val="0B2545"/>
+        </w:rPr>
+        <w:t xml:space="preserve">实验 3｜蒸腾套袋：</w:t>
+      </w:r>
+      <w:r>
+        <w:t xml:space="preserve">准备有叶袋和空袋，比较袋壁是否出现水滴。叶片通过气孔散失水蒸气，称为蒸腾作用（transpiration）；水蒸气遇到袋壁可能凝成水滴。</w:t>
+      </w:r>
+    </w:p>
+    <w:p>
+      <w:pPr>
+        <w:pStyle w:val="SchoolAlignment"/>
+        <w:pBdr>
+          <w:left w:val="single" w:sz="6" w:space="7" w:color="C2AD88"/>
+        </w:pBdr>
+        <w:shd w:val="clear" w:color="auto" w:fill="F8F4EC"/>
+        <w:ind w:left="230" w:right="144"/>
+      </w:pPr>
+      <w:r>
+        <w:rPr>
+          <w:color w:val="333333"/>
+        </w:rPr>
+        <w:t xml:space="preserve">课堂时间紧，一小时内没有看到明显水滴，我们便简单结束了观察。</w:t>
+      </w:r>
+    </w:p>
+    <w:p>
+      <w:pPr>
+        <w:pStyle w:val="KnowledgeSummary"/>
+        <w:rPr>
+          <w:b/>
+          <w:bCs/>
+        </w:rPr>
+      </w:pPr>
+      <w:r>
+        <w:rPr>
+          <w:b/>
+          <w:bCs/>
+          <w:color w:val="0B2545"/>
+        </w:rPr>
+        <w:t xml:space="preserve">小结：</w:t>
+      </w:r>
+      <w:r>
+        <w:t xml:space="preserve">染色显示水沿木质部向上到达花瓣；叶片经气孔散失水蒸气，蒸腾作用（transpiration）又帮助更多水上行。维管植物（vascular plants）有木质部等维管组织。非维管植物（non-vascular plants）没有这些组织。</w:t>
       </w:r>
     </w:p>
     <w:p>
@@ -4058,28 +4035,16 @@
       <w:r>
         <w:rPr>
           <w:b/>
-          <w:color w:val="0B2545"/>
-        </w:rPr>
-        <w:t xml:space="preserve">School </w:t>
-      </w:r>
-      <w:r>
-        <w:rPr>
-          <w:b/>
-          <w:color w:val="0B2545"/>
-        </w:rPr>
-        <w:t>对应｜</w:t>
-      </w:r>
-      <w:r>
-        <w:t>Unit 4 — Notes 06 Vascular and Non Vascular Plants</w:t>
-      </w:r>
-      <w:r>
-        <w:t>。区分维管植物与非维管植物，连接木质部、韧皮部（</w:t>
-      </w:r>
-      <w:r>
-        <w:t>phloem</w:t>
-      </w:r>
-      <w:r>
-        <w:t>）和蒸腾作用。韧皮部运输糖属于讲解内容，有色水实验追踪的是水。</w:t>
+          <w:bCs/>
+          <w:color w:val="0B2545"/>
+        </w:rPr>
+        <w:t xml:space="preserve">School 对应｜</w:t>
+      </w:r>
+      <w:r>
+        <w:rPr>
+          <w:color w:val="0B2545"/>
+        </w:rPr>
+        <w:t xml:space="preserve">Unit 4 — Notes 06 Vascular and Non Vascular Plants：木质部的水路、气孔与蒸腾，维管植物与非维管植物。</w:t>
       </w:r>
     </w:p>
     <w:p>
@@ -4087,30 +4052,12 @@
         <w:pStyle w:val="1"/>
       </w:pPr>
       <w:r>
-        <w:t>与</w:t>
-      </w:r>
-      <w:r>
-        <w:t xml:space="preserve"> School </w:t>
-      </w:r>
-      <w:r>
-        <w:t>课程的对应总表</w:t>
-      </w:r>
-    </w:p>
-    <w:p>
-      <w:r>
-        <w:t>暑假九次课涉及</w:t>
-      </w:r>
-      <w:r>
-        <w:t xml:space="preserve"> School </w:t>
-      </w:r>
-      <w:r>
-        <w:t>的</w:t>
-      </w:r>
-      <w:r>
-        <w:t xml:space="preserve"> Unit 1–4</w:t>
-      </w:r>
-      <w:r>
-        <w:t>。下表列出对应的学校材料与实验内容；只涉及部分概念的条目单独注明。</w:t>
+        <w:t xml:space="preserve">与 School 课程的对应总表</w:t>
+      </w:r>
+    </w:p>
+    <w:p>
+      <w:r>
+        <w:t xml:space="preserve">暑假九次课涉及 School 的 Unit 1–4。下表列出对应的学校材料与实验内容；只涉及部分概念的条目单独注明。</w:t>
       </w:r>
     </w:p>
     <w:tbl>
@@ -4162,7 +4109,7 @@
                 <w:bCs/>
                 <w:color w:val="0B2545"/>
               </w:rPr>
-              <w:t>School Unit</w:t>
+              <w:t xml:space="preserve">School Unit</w:t>
             </w:r>
           </w:p>
         </w:tc>
@@ -4183,21 +4130,34 @@
                 <w:bCs/>
                 <w:color w:val="0B2545"/>
               </w:rPr>
-              <w:t xml:space="preserve">School </w:t>
-            </w:r>
+              <w:t xml:space="preserve">School 材料（哪一节）</w:t>
+            </w:r>
+          </w:p>
+        </w:tc>
+        <w:tc>
+          <w:tcPr>
+            <w:tcW w:w="1100" w:type="dxa"/>
+            <w:shd w:val="clear" w:color="auto" w:fill="F2F4F7"/>
+            <w:vAlign w:val="center"/>
+          </w:tcPr>
+          <w:p>
+            <w:pPr>
+              <w:pStyle w:val="TableText"/>
+              <w:jc w:val="center"/>
+            </w:pPr>
             <w:r>
               <w:rPr>
                 <w:b/>
                 <w:bCs/>
                 <w:color w:val="0B2545"/>
               </w:rPr>
-              <w:t>材料（哪一节）</w:t>
-            </w:r>
-          </w:p>
-        </w:tc>
-        <w:tc>
-          <w:tcPr>
-            <w:tcW w:w="1100" w:type="dxa"/>
+              <w:t xml:space="preserve">对应课次</w:t>
+            </w:r>
+          </w:p>
+        </w:tc>
+        <w:tc>
+          <w:tcPr>
+            <w:tcW w:w="2760" w:type="dxa"/>
             <w:shd w:val="clear" w:color="auto" w:fill="F2F4F7"/>
             <w:vAlign w:val="center"/>
           </w:tcPr>
@@ -4212,14 +4172,20 @@
                 <w:bCs/>
                 <w:color w:val="0B2545"/>
               </w:rPr>
-              <w:t>对应课次</w:t>
-            </w:r>
-          </w:p>
-        </w:tc>
-        <w:tc>
-          <w:tcPr>
-            <w:tcW w:w="2760" w:type="dxa"/>
-            <w:shd w:val="clear" w:color="auto" w:fill="F2F4F7"/>
+              <w:t xml:space="preserve">覆盖说明</w:t>
+            </w:r>
+          </w:p>
+        </w:tc>
+      </w:tr>
+      <w:tr>
+        <w:trPr>
+          <w:cantSplit/>
+        </w:trPr>
+        <w:tc>
+          <w:tcPr>
+            <w:tcW w:w="1300" w:type="dxa"/>
+            <w:vMerge w:val="restart"/>
+            <w:shd w:val="clear" w:color="auto" w:fill="EEF4FA"/>
             <w:vAlign w:val="center"/>
           </w:tcPr>
           <w:p>
@@ -4233,7 +4199,50 @@
                 <w:bCs/>
                 <w:color w:val="0B2545"/>
               </w:rPr>
-              <w:t>覆盖说明</w:t>
+              <w:t xml:space="preserve">Unit 1</w:t>
+            </w:r>
+          </w:p>
+        </w:tc>
+        <w:tc>
+          <w:tcPr>
+            <w:tcW w:w="4200" w:type="dxa"/>
+            <w:vAlign w:val="center"/>
+          </w:tcPr>
+          <w:p>
+            <w:pPr>
+              <w:pStyle w:val="TableText"/>
+            </w:pPr>
+            <w:r>
+              <w:t xml:space="preserve">Notes 01 · Observation and Inference</w:t>
+            </w:r>
+          </w:p>
+        </w:tc>
+        <w:tc>
+          <w:tcPr>
+            <w:tcW w:w="1100" w:type="dxa"/>
+            <w:vAlign w:val="center"/>
+          </w:tcPr>
+          <w:p>
+            <w:pPr>
+              <w:pStyle w:val="TableText"/>
+              <w:jc w:val="center"/>
+            </w:pPr>
+            <w:r>
+              <w:t xml:space="preserve">第 1 次课</w:t>
+            </w:r>
+          </w:p>
+        </w:tc>
+        <w:tc>
+          <w:tcPr>
+            <w:tcW w:w="2760" w:type="dxa"/>
+            <w:vAlign w:val="center"/>
+          </w:tcPr>
+          <w:p>
+            <w:pPr>
+              <w:pStyle w:val="TableText"/>
+            </w:pPr>
+            <w:r>
+              <w:t xml:space="preserve">核心覆盖；后续实验持续使用</w:t>
             </w:r>
           </w:p>
         </w:tc>
@@ -4245,8 +4254,130 @@
         <w:tc>
           <w:tcPr>
             <w:tcW w:w="1300" w:type="dxa"/>
+            <w:vMerge/>
+            <w:shd w:val="clear" w:color="auto" w:fill="EEF4FA"/>
+            <w:vAlign w:val="center"/>
+          </w:tcPr>
+          <w:p>
+            <w:r>
+              <w:t xml:space="preserve">Unit 1</w:t>
+            </w:r>
+          </w:p>
+        </w:tc>
+        <w:tc>
+          <w:tcPr>
+            <w:tcW w:w="4200" w:type="dxa"/>
+            <w:vAlign w:val="center"/>
+          </w:tcPr>
+          <w:p>
+            <w:pPr>
+              <w:pStyle w:val="TableText"/>
+            </w:pPr>
+            <w:r>
+              <w:t xml:space="preserve">Notes 02 · Quantitative and Qualitative Data</w:t>
+            </w:r>
+          </w:p>
+        </w:tc>
+        <w:tc>
+          <w:tcPr>
+            <w:tcW w:w="1100" w:type="dxa"/>
+            <w:vAlign w:val="center"/>
+          </w:tcPr>
+          <w:p>
+            <w:pPr>
+              <w:pStyle w:val="TableText"/>
+              <w:jc w:val="center"/>
+            </w:pPr>
+            <w:r>
+              <w:t xml:space="preserve">第 1 次课</w:t>
+            </w:r>
+          </w:p>
+        </w:tc>
+        <w:tc>
+          <w:tcPr>
+            <w:tcW w:w="2760" w:type="dxa"/>
+            <w:vAlign w:val="center"/>
+          </w:tcPr>
+          <w:p>
+            <w:pPr>
+              <w:pStyle w:val="TableText"/>
+            </w:pPr>
+            <w:r>
+              <w:t xml:space="preserve">核心覆盖；定性观察与定量测量</w:t>
+            </w:r>
+          </w:p>
+        </w:tc>
+      </w:tr>
+      <w:tr>
+        <w:trPr>
+          <w:cantSplit/>
+        </w:trPr>
+        <w:tc>
+          <w:tcPr>
+            <w:tcW w:w="1300" w:type="dxa"/>
+            <w:vMerge/>
+            <w:shd w:val="clear" w:color="auto" w:fill="EEF4FA"/>
+            <w:vAlign w:val="center"/>
+          </w:tcPr>
+          <w:p>
+            <w:r>
+              <w:t xml:space="preserve">Unit 1</w:t>
+            </w:r>
+          </w:p>
+        </w:tc>
+        <w:tc>
+          <w:tcPr>
+            <w:tcW w:w="4200" w:type="dxa"/>
+            <w:vAlign w:val="center"/>
+          </w:tcPr>
+          <w:p>
+            <w:pPr>
+              <w:pStyle w:val="TableText"/>
+            </w:pPr>
+            <w:r>
+              <w:t xml:space="preserve">Notes 03 · Testable Questions</w:t>
+            </w:r>
+          </w:p>
+        </w:tc>
+        <w:tc>
+          <w:tcPr>
+            <w:tcW w:w="1100" w:type="dxa"/>
+            <w:vAlign w:val="center"/>
+          </w:tcPr>
+          <w:p>
+            <w:pPr>
+              <w:pStyle w:val="TableText"/>
+              <w:jc w:val="center"/>
+            </w:pPr>
+            <w:r>
+              <w:t xml:space="preserve">第 1 次课</w:t>
+            </w:r>
+          </w:p>
+        </w:tc>
+        <w:tc>
+          <w:tcPr>
+            <w:tcW w:w="2760" w:type="dxa"/>
+            <w:vAlign w:val="center"/>
+          </w:tcPr>
+          <w:p>
+            <w:pPr>
+              <w:pStyle w:val="TableText"/>
+            </w:pPr>
+            <w:r>
+              <w:t xml:space="preserve">核心覆盖；变量与公平实验</w:t>
+            </w:r>
+          </w:p>
+        </w:tc>
+      </w:tr>
+      <w:tr>
+        <w:trPr>
+          <w:cantSplit/>
+        </w:trPr>
+        <w:tc>
+          <w:tcPr>
+            <w:tcW w:w="1300" w:type="dxa"/>
             <w:vMerge w:val="restart"/>
-            <w:shd w:val="clear" w:color="auto" w:fill="EEF4FA"/>
+            <w:shd w:val="clear" w:color="auto" w:fill="F6F2E8"/>
             <w:vAlign w:val="center"/>
           </w:tcPr>
           <w:p>
@@ -4260,7 +4391,7 @@
                 <w:bCs/>
                 <w:color w:val="0B2545"/>
               </w:rPr>
-              <w:t>Unit 1</w:t>
+              <w:t xml:space="preserve">Unit 2</w:t>
             </w:r>
           </w:p>
         </w:tc>
@@ -4274,7 +4405,7 @@
               <w:pStyle w:val="TableText"/>
             </w:pPr>
             <w:r>
-              <w:t>Notes 01 · Observation and Inference</w:t>
+              <w:t xml:space="preserve">Notes 01 · Phases of Matter</w:t>
             </w:r>
           </w:p>
         </w:tc>
@@ -4289,13 +4420,7 @@
               <w:jc w:val="center"/>
             </w:pPr>
             <w:r>
-              <w:t>第</w:t>
-            </w:r>
-            <w:r>
-              <w:t xml:space="preserve"> 1 </w:t>
-            </w:r>
-            <w:r>
-              <w:t>次课</w:t>
+              <w:t xml:space="preserve">第 3、7 次课</w:t>
             </w:r>
           </w:p>
         </w:tc>
@@ -4309,7 +4434,7 @@
               <w:pStyle w:val="TableText"/>
             </w:pPr>
             <w:r>
-              <w:t>核心覆盖；后续实验持续使用</w:t>
+              <w:t xml:space="preserve">第3课：三态、相变及变化判断；第7课：空气具有质量、占据空间</w:t>
             </w:r>
           </w:p>
         </w:tc>
@@ -4322,10 +4447,14 @@
           <w:tcPr>
             <w:tcW w:w="1300" w:type="dxa"/>
             <w:vMerge/>
-            <w:shd w:val="clear" w:color="auto" w:fill="EEF4FA"/>
-            <w:vAlign w:val="center"/>
-          </w:tcPr>
-          <w:p/>
+            <w:shd w:val="clear" w:color="auto" w:fill="F6F2E8"/>
+            <w:vAlign w:val="center"/>
+          </w:tcPr>
+          <w:p>
+            <w:r>
+              <w:t xml:space="preserve">Unit 2</w:t>
+            </w:r>
+          </w:p>
         </w:tc>
         <w:tc>
           <w:tcPr>
@@ -4337,7 +4466,7 @@
               <w:pStyle w:val="TableText"/>
             </w:pPr>
             <w:r>
-              <w:t>Notes 02 · Quantitative and Qualitative Data</w:t>
+              <w:t xml:space="preserve">Notes 02 · Mixtures and Solutions</w:t>
             </w:r>
           </w:p>
         </w:tc>
@@ -4352,13 +4481,7 @@
               <w:jc w:val="center"/>
             </w:pPr>
             <w:r>
-              <w:t>第</w:t>
-            </w:r>
-            <w:r>
-              <w:t xml:space="preserve"> 1 </w:t>
-            </w:r>
-            <w:r>
-              <w:t>次课</w:t>
+              <w:t xml:space="preserve">第 2、3、7 次课</w:t>
             </w:r>
           </w:p>
         </w:tc>
@@ -4372,7 +4495,7 @@
               <w:pStyle w:val="TableText"/>
             </w:pPr>
             <w:r>
-              <w:t>核心覆盖；定性观察与定量测量</w:t>
+              <w:t xml:space="preserve">第2课：溶解与分离；第3课：回看溶解与结晶证据；第7课：空气是均一混合物</w:t>
             </w:r>
           </w:p>
         </w:tc>
@@ -4385,10 +4508,14 @@
           <w:tcPr>
             <w:tcW w:w="1300" w:type="dxa"/>
             <w:vMerge/>
-            <w:shd w:val="clear" w:color="auto" w:fill="EEF4FA"/>
-            <w:vAlign w:val="center"/>
-          </w:tcPr>
-          <w:p/>
+            <w:shd w:val="clear" w:color="auto" w:fill="F6F2E8"/>
+            <w:vAlign w:val="center"/>
+          </w:tcPr>
+          <w:p>
+            <w:r>
+              <w:t xml:space="preserve">Unit 2</w:t>
+            </w:r>
+          </w:p>
         </w:tc>
         <w:tc>
           <w:tcPr>
@@ -4400,7 +4527,7 @@
               <w:pStyle w:val="TableText"/>
             </w:pPr>
             <w:r>
-              <w:t>Notes 03 · Testable Questions</w:t>
+              <w:t xml:space="preserve">Notes 03 · Atoms and Period Square</w:t>
             </w:r>
           </w:p>
         </w:tc>
@@ -4415,13 +4542,7 @@
               <w:jc w:val="center"/>
             </w:pPr>
             <w:r>
-              <w:t>第</w:t>
-            </w:r>
-            <w:r>
-              <w:t xml:space="preserve"> 1 </w:t>
-            </w:r>
-            <w:r>
-              <w:t>次课</w:t>
+              <w:t xml:space="preserve">第 3 次课</w:t>
             </w:r>
           </w:p>
         </w:tc>
@@ -4435,7 +4556,7 @@
               <w:pStyle w:val="TableText"/>
             </w:pPr>
             <w:r>
-              <w:t>核心覆盖；变量与公平实验</w:t>
+              <w:t xml:space="preserve">基础衔接；原子、元素与原子重组</w:t>
             </w:r>
           </w:p>
         </w:tc>
@@ -4448,7 +4569,7 @@
           <w:tcPr>
             <w:tcW w:w="1300" w:type="dxa"/>
             <w:vMerge w:val="restart"/>
-            <w:shd w:val="clear" w:color="auto" w:fill="F6F2E8"/>
+            <w:shd w:val="clear" w:color="auto" w:fill="EEF5F0"/>
             <w:vAlign w:val="center"/>
           </w:tcPr>
           <w:p>
@@ -4462,7 +4583,7 @@
                 <w:bCs/>
                 <w:color w:val="0B2545"/>
               </w:rPr>
-              <w:t>Unit 2</w:t>
+              <w:t xml:space="preserve">Unit 3</w:t>
             </w:r>
           </w:p>
         </w:tc>
@@ -4476,7 +4597,7 @@
               <w:pStyle w:val="TableText"/>
             </w:pPr>
             <w:r>
-              <w:t>Notes 01 · Phases of Matter</w:t>
+              <w:t xml:space="preserve">Notes 01 · Energy Forms and Transfers</w:t>
             </w:r>
           </w:p>
         </w:tc>
@@ -4491,19 +4612,7 @@
               <w:jc w:val="center"/>
             </w:pPr>
             <w:r>
-              <w:t>第</w:t>
-            </w:r>
-            <w:r>
-              <w:t xml:space="preserve"> 3</w:t>
-            </w:r>
-            <w:r>
-              <w:t>、</w:t>
-            </w:r>
-            <w:r>
-              <w:t xml:space="preserve">7 </w:t>
-            </w:r>
-            <w:r>
-              <w:t>次课</w:t>
+              <w:t xml:space="preserve">第 4 次课</w:t>
             </w:r>
           </w:p>
         </w:tc>
@@ -4517,19 +4626,7 @@
               <w:pStyle w:val="TableText"/>
             </w:pPr>
             <w:r>
-              <w:t>第</w:t>
-            </w:r>
-            <w:r>
-              <w:t>3</w:t>
-            </w:r>
-            <w:r>
-              <w:t>课：三态、相变及变化判断；第</w:t>
-            </w:r>
-            <w:r>
-              <w:t>7</w:t>
-            </w:r>
-            <w:r>
-              <w:t>课：空气具有质量、占据空间</w:t>
+              <w:t xml:space="preserve">入门覆盖；能量转移与转化</w:t>
             </w:r>
           </w:p>
         </w:tc>
@@ -4542,10 +4639,14 @@
           <w:tcPr>
             <w:tcW w:w="1300" w:type="dxa"/>
             <w:vMerge/>
-            <w:shd w:val="clear" w:color="auto" w:fill="F6F2E8"/>
-            <w:vAlign w:val="center"/>
-          </w:tcPr>
-          <w:p/>
+            <w:shd w:val="clear" w:color="auto" w:fill="EEF5F0"/>
+            <w:vAlign w:val="center"/>
+          </w:tcPr>
+          <w:p>
+            <w:r>
+              <w:t xml:space="preserve">Unit 3</w:t>
+            </w:r>
+          </w:p>
         </w:tc>
         <w:tc>
           <w:tcPr>
@@ -4557,7 +4658,7 @@
               <w:pStyle w:val="TableText"/>
             </w:pPr>
             <w:r>
-              <w:t>Notes 02 · Mixtures and Solutions</w:t>
+              <w:t xml:space="preserve">Notes 02 · Thermal Energy Transfer</w:t>
             </w:r>
           </w:p>
         </w:tc>
@@ -4572,25 +4673,7 @@
               <w:jc w:val="center"/>
             </w:pPr>
             <w:r>
-              <w:t>第</w:t>
-            </w:r>
-            <w:r>
-              <w:t xml:space="preserve"> 2</w:t>
-            </w:r>
-            <w:r>
-              <w:t>、</w:t>
-            </w:r>
-            <w:r>
-              <w:t>3</w:t>
-            </w:r>
-            <w:r>
-              <w:t>、</w:t>
-            </w:r>
-            <w:r>
-              <w:t xml:space="preserve">7 </w:t>
-            </w:r>
-            <w:r>
-              <w:t>次课</w:t>
+              <w:t xml:space="preserve">第 4 次课</w:t>
             </w:r>
           </w:p>
         </w:tc>
@@ -4604,25 +4687,7 @@
               <w:pStyle w:val="TableText"/>
             </w:pPr>
             <w:r>
-              <w:t>第</w:t>
-            </w:r>
-            <w:r>
-              <w:t>2</w:t>
-            </w:r>
-            <w:r>
-              <w:t>课：溶解与分离；第</w:t>
-            </w:r>
-            <w:r>
-              <w:t>3</w:t>
-            </w:r>
-            <w:r>
-              <w:t>课：回看溶解与结晶证据；第</w:t>
-            </w:r>
-            <w:r>
-              <w:t>7</w:t>
-            </w:r>
-            <w:r>
-              <w:t>课：空气是均一混合物</w:t>
+              <w:t xml:space="preserve">核心覆盖；传导、对流、辐射</w:t>
             </w:r>
           </w:p>
         </w:tc>
@@ -4635,10 +4700,14 @@
           <w:tcPr>
             <w:tcW w:w="1300" w:type="dxa"/>
             <w:vMerge/>
-            <w:shd w:val="clear" w:color="auto" w:fill="F6F2E8"/>
-            <w:vAlign w:val="center"/>
-          </w:tcPr>
-          <w:p/>
+            <w:shd w:val="clear" w:color="auto" w:fill="EEF5F0"/>
+            <w:vAlign w:val="center"/>
+          </w:tcPr>
+          <w:p>
+            <w:r>
+              <w:t xml:space="preserve">Unit 3</w:t>
+            </w:r>
+          </w:p>
         </w:tc>
         <w:tc>
           <w:tcPr>
@@ -4650,7 +4719,7 @@
               <w:pStyle w:val="TableText"/>
             </w:pPr>
             <w:r>
-              <w:t>Notes 03 · Atoms and Period Square</w:t>
+              <w:t xml:space="preserve">Notes 03 · Electromagnetic Spectrum</w:t>
             </w:r>
           </w:p>
         </w:tc>
@@ -4665,13 +4734,7 @@
               <w:jc w:val="center"/>
             </w:pPr>
             <w:r>
-              <w:t>第</w:t>
-            </w:r>
-            <w:r>
-              <w:t xml:space="preserve"> 3 </w:t>
-            </w:r>
-            <w:r>
-              <w:t>次课</w:t>
+              <w:t xml:space="preserve">第 5 次课</w:t>
             </w:r>
           </w:p>
         </w:tc>
@@ -4685,7 +4748,7 @@
               <w:pStyle w:val="TableText"/>
             </w:pPr>
             <w:r>
-              <w:t>基础衔接；原子、元素与原子重组</w:t>
+              <w:t xml:space="preserve">聚焦可见光及光与物质作用</w:t>
             </w:r>
           </w:p>
         </w:tc>
@@ -4697,8 +4760,313 @@
         <w:tc>
           <w:tcPr>
             <w:tcW w:w="1300" w:type="dxa"/>
+            <w:vMerge/>
+            <w:shd w:val="clear" w:color="auto" w:fill="EEF5F0"/>
+            <w:vAlign w:val="center"/>
+          </w:tcPr>
+          <w:p>
+            <w:r>
+              <w:t xml:space="preserve">Unit 3</w:t>
+            </w:r>
+          </w:p>
+        </w:tc>
+        <w:tc>
+          <w:tcPr>
+            <w:tcW w:w="4200" w:type="dxa"/>
+            <w:vAlign w:val="center"/>
+          </w:tcPr>
+          <w:p>
+            <w:pPr>
+              <w:pStyle w:val="TableText"/>
+            </w:pPr>
+            <w:r>
+              <w:t xml:space="preserve">Notes 04 · Vectors, Velocity, Acceleration</w:t>
+            </w:r>
+          </w:p>
+        </w:tc>
+        <w:tc>
+          <w:tcPr>
+            <w:tcW w:w="1100" w:type="dxa"/>
+            <w:vAlign w:val="center"/>
+          </w:tcPr>
+          <w:p>
+            <w:pPr>
+              <w:pStyle w:val="TableText"/>
+              <w:jc w:val="center"/>
+            </w:pPr>
+            <w:r>
+              <w:t xml:space="preserve">第 6 次课</w:t>
+            </w:r>
+          </w:p>
+        </w:tc>
+        <w:tc>
+          <w:tcPr>
+            <w:tcW w:w="2760" w:type="dxa"/>
+            <w:vAlign w:val="center"/>
+          </w:tcPr>
+          <w:p>
+            <w:pPr>
+              <w:pStyle w:val="TableText"/>
+            </w:pPr>
+            <w:r>
+              <w:t xml:space="preserve">标尺纸带、慢动作录像与等时位置比较；认识加速度</w:t>
+            </w:r>
+          </w:p>
+        </w:tc>
+      </w:tr>
+      <w:tr>
+        <w:trPr>
+          <w:cantSplit/>
+        </w:trPr>
+        <w:tc>
+          <w:tcPr>
+            <w:tcW w:w="1300" w:type="dxa"/>
+            <w:vMerge/>
+            <w:shd w:val="clear" w:color="auto" w:fill="EEF5F0"/>
+            <w:vAlign w:val="center"/>
+          </w:tcPr>
+          <w:p>
+            <w:r>
+              <w:t xml:space="preserve">Unit 3</w:t>
+            </w:r>
+          </w:p>
+        </w:tc>
+        <w:tc>
+          <w:tcPr>
+            <w:tcW w:w="4200" w:type="dxa"/>
+            <w:vAlign w:val="center"/>
+          </w:tcPr>
+          <w:p>
+            <w:pPr>
+              <w:pStyle w:val="TableText"/>
+            </w:pPr>
+            <w:r>
+              <w:t xml:space="preserve">Notes 05 · Newton’s First Law</w:t>
+            </w:r>
+          </w:p>
+        </w:tc>
+        <w:tc>
+          <w:tcPr>
+            <w:tcW w:w="1100" w:type="dxa"/>
+            <w:vAlign w:val="center"/>
+          </w:tcPr>
+          <w:p>
+            <w:pPr>
+              <w:pStyle w:val="TableText"/>
+              <w:jc w:val="center"/>
+            </w:pPr>
+            <w:r>
+              <w:t xml:space="preserve">第 6 次课</w:t>
+            </w:r>
+          </w:p>
+        </w:tc>
+        <w:tc>
+          <w:tcPr>
+            <w:tcW w:w="2760" w:type="dxa"/>
+            <w:vAlign w:val="center"/>
+          </w:tcPr>
+          <w:p>
+            <w:pPr>
+              <w:pStyle w:val="TableText"/>
+            </w:pPr>
+            <w:r>
+              <w:t xml:space="preserve">简要介绍惯性与第一定律</w:t>
+            </w:r>
+          </w:p>
+        </w:tc>
+      </w:tr>
+      <w:tr>
+        <w:trPr>
+          <w:cantSplit/>
+        </w:trPr>
+        <w:tc>
+          <w:tcPr>
+            <w:tcW w:w="1300" w:type="dxa"/>
+            <w:vMerge/>
+            <w:shd w:val="clear" w:color="auto" w:fill="EEF5F0"/>
+            <w:vAlign w:val="center"/>
+          </w:tcPr>
+          <w:p>
+            <w:r>
+              <w:t xml:space="preserve">Unit 3</w:t>
+            </w:r>
+          </w:p>
+        </w:tc>
+        <w:tc>
+          <w:tcPr>
+            <w:tcW w:w="4200" w:type="dxa"/>
+            <w:vAlign w:val="center"/>
+          </w:tcPr>
+          <w:p>
+            <w:pPr>
+              <w:pStyle w:val="TableText"/>
+            </w:pPr>
+            <w:r>
+              <w:t xml:space="preserve">Notes 06 · Newton’s Second Law</w:t>
+            </w:r>
+          </w:p>
+        </w:tc>
+        <w:tc>
+          <w:tcPr>
+            <w:tcW w:w="1100" w:type="dxa"/>
+            <w:vAlign w:val="center"/>
+          </w:tcPr>
+          <w:p>
+            <w:pPr>
+              <w:pStyle w:val="TableText"/>
+              <w:jc w:val="center"/>
+            </w:pPr>
+            <w:r>
+              <w:t xml:space="preserve">第 6 次课</w:t>
+            </w:r>
+          </w:p>
+        </w:tc>
+        <w:tc>
+          <w:tcPr>
+            <w:tcW w:w="2760" w:type="dxa"/>
+            <w:vAlign w:val="center"/>
+          </w:tcPr>
+          <w:p>
+            <w:pPr>
+              <w:pStyle w:val="TableText"/>
+            </w:pPr>
+            <w:r>
+              <w:t xml:space="preserve">得到力、质量影响加速度的两条变化规律；尚未通过完整计算建立 F＝ma</w:t>
+            </w:r>
+          </w:p>
+        </w:tc>
+      </w:tr>
+      <w:tr>
+        <w:trPr>
+          <w:cantSplit/>
+        </w:trPr>
+        <w:tc>
+          <w:tcPr>
+            <w:tcW w:w="1300" w:type="dxa"/>
+            <w:vMerge/>
+            <w:shd w:val="clear" w:color="auto" w:fill="EEF5F0"/>
+            <w:vAlign w:val="center"/>
+          </w:tcPr>
+          <w:p>
+            <w:r>
+              <w:t xml:space="preserve">Unit 3</w:t>
+            </w:r>
+          </w:p>
+        </w:tc>
+        <w:tc>
+          <w:tcPr>
+            <w:tcW w:w="4200" w:type="dxa"/>
+            <w:vAlign w:val="center"/>
+          </w:tcPr>
+          <w:p>
+            <w:pPr>
+              <w:pStyle w:val="TableText"/>
+            </w:pPr>
+            <w:r>
+              <w:t xml:space="preserve">Notes 07 · Newton’s Third Law</w:t>
+            </w:r>
+          </w:p>
+        </w:tc>
+        <w:tc>
+          <w:tcPr>
+            <w:tcW w:w="1100" w:type="dxa"/>
+            <w:vAlign w:val="center"/>
+          </w:tcPr>
+          <w:p>
+            <w:pPr>
+              <w:pStyle w:val="TableText"/>
+              <w:jc w:val="center"/>
+            </w:pPr>
+            <w:r>
+              <w:t xml:space="preserve">第 6 次课</w:t>
+            </w:r>
+          </w:p>
+        </w:tc>
+        <w:tc>
+          <w:tcPr>
+            <w:tcW w:w="2760" w:type="dxa"/>
+            <w:vAlign w:val="center"/>
+          </w:tcPr>
+          <w:p>
+            <w:pPr>
+              <w:pStyle w:val="TableText"/>
+            </w:pPr>
+            <w:r>
+              <w:t xml:space="preserve">气球动力车与作用力、反作用力</w:t>
+            </w:r>
+          </w:p>
+        </w:tc>
+      </w:tr>
+      <w:tr>
+        <w:trPr>
+          <w:cantSplit/>
+        </w:trPr>
+        <w:tc>
+          <w:tcPr>
+            <w:tcW w:w="1300" w:type="dxa"/>
+            <w:vMerge/>
+            <w:shd w:val="clear" w:color="auto" w:fill="EEF5F0"/>
+            <w:vAlign w:val="center"/>
+          </w:tcPr>
+          <w:p>
+            <w:r>
+              <w:t xml:space="preserve">Unit 3</w:t>
+            </w:r>
+          </w:p>
+        </w:tc>
+        <w:tc>
+          <w:tcPr>
+            <w:tcW w:w="4200" w:type="dxa"/>
+            <w:vAlign w:val="center"/>
+          </w:tcPr>
+          <w:p>
+            <w:pPr>
+              <w:pStyle w:val="TableText"/>
+            </w:pPr>
+            <w:r>
+              <w:t xml:space="preserve">Homework 02 · Light Energy Book</w:t>
+            </w:r>
+          </w:p>
+        </w:tc>
+        <w:tc>
+          <w:tcPr>
+            <w:tcW w:w="1100" w:type="dxa"/>
+            <w:vAlign w:val="center"/>
+          </w:tcPr>
+          <w:p>
+            <w:pPr>
+              <w:pStyle w:val="TableText"/>
+              <w:jc w:val="center"/>
+            </w:pPr>
+            <w:r>
+              <w:t xml:space="preserve">第 5 次课</w:t>
+            </w:r>
+          </w:p>
+        </w:tc>
+        <w:tc>
+          <w:tcPr>
+            <w:tcW w:w="2760" w:type="dxa"/>
+            <w:vAlign w:val="center"/>
+          </w:tcPr>
+          <w:p>
+            <w:pPr>
+              <w:pStyle w:val="TableText"/>
+            </w:pPr>
+            <w:r>
+              <w:t xml:space="preserve">用四组实验完成应用与解释</w:t>
+            </w:r>
+          </w:p>
+        </w:tc>
+      </w:tr>
+      <w:tr>
+        <w:trPr>
+          <w:cantSplit/>
+        </w:trPr>
+        <w:tc>
+          <w:tcPr>
+            <w:tcW w:w="1300" w:type="dxa"/>
             <w:vMerge w:val="restart"/>
-            <w:shd w:val="clear" w:color="auto" w:fill="EEF5F0"/>
+            <w:shd w:val="clear" w:color="auto" w:fill="F3EFF6"/>
             <w:vAlign w:val="center"/>
           </w:tcPr>
           <w:p>
@@ -4712,7 +5080,7 @@
                 <w:bCs/>
                 <w:color w:val="0B2545"/>
               </w:rPr>
-              <w:t>Unit 3</w:t>
+              <w:t xml:space="preserve">Unit 4</w:t>
             </w:r>
           </w:p>
         </w:tc>
@@ -4726,7 +5094,7 @@
               <w:pStyle w:val="TableText"/>
             </w:pPr>
             <w:r>
-              <w:t>Notes 01 · Energy Forms and Transfers</w:t>
+              <w:t xml:space="preserve">Notes 01 · Characteristics of Living Things</w:t>
             </w:r>
           </w:p>
         </w:tc>
@@ -4741,13 +5109,7 @@
               <w:jc w:val="center"/>
             </w:pPr>
             <w:r>
-              <w:t>第</w:t>
-            </w:r>
-            <w:r>
-              <w:t xml:space="preserve"> 4 </w:t>
-            </w:r>
-            <w:r>
-              <w:t>次课</w:t>
+              <w:t xml:space="preserve">第 8 次课</w:t>
             </w:r>
           </w:p>
         </w:tc>
@@ -4761,7 +5123,7 @@
               <w:pStyle w:val="TableText"/>
             </w:pPr>
             <w:r>
-              <w:t>入门覆盖；能量转移与转化</w:t>
+              <w:t xml:space="preserve">细胞组成与生长；种豆启动后缺少连续观察数据</w:t>
             </w:r>
           </w:p>
         </w:tc>
@@ -4774,10 +5136,14 @@
           <w:tcPr>
             <w:tcW w:w="1300" w:type="dxa"/>
             <w:vMerge/>
-            <w:shd w:val="clear" w:color="auto" w:fill="EEF5F0"/>
-            <w:vAlign w:val="center"/>
-          </w:tcPr>
-          <w:p/>
+            <w:shd w:val="clear" w:color="auto" w:fill="F3EFF6"/>
+            <w:vAlign w:val="center"/>
+          </w:tcPr>
+          <w:p>
+            <w:r>
+              <w:t xml:space="preserve">Unit 4</w:t>
+            </w:r>
+          </w:p>
         </w:tc>
         <w:tc>
           <w:tcPr>
@@ -4789,7 +5155,7 @@
               <w:pStyle w:val="TableText"/>
             </w:pPr>
             <w:r>
-              <w:t>Notes 02 · Thermal Energy Transfer</w:t>
+              <w:t xml:space="preserve">Notes 02 · Cell Structure</w:t>
             </w:r>
           </w:p>
         </w:tc>
@@ -4804,13 +5170,7 @@
               <w:jc w:val="center"/>
             </w:pPr>
             <w:r>
-              <w:t>第</w:t>
-            </w:r>
-            <w:r>
-              <w:t xml:space="preserve"> 4 </w:t>
-            </w:r>
-            <w:r>
-              <w:t>次课</w:t>
+              <w:t xml:space="preserve">第 8 次课</w:t>
             </w:r>
           </w:p>
         </w:tc>
@@ -4824,7 +5184,7 @@
               <w:pStyle w:val="TableText"/>
             </w:pPr>
             <w:r>
-              <w:t>核心覆盖；传导、对流、辐射</w:t>
+              <w:t xml:space="preserve">动植物细胞、主要结构及功能、细胞学说</w:t>
             </w:r>
           </w:p>
         </w:tc>
@@ -4837,10 +5197,14 @@
           <w:tcPr>
             <w:tcW w:w="1300" w:type="dxa"/>
             <w:vMerge/>
-            <w:shd w:val="clear" w:color="auto" w:fill="EEF5F0"/>
-            <w:vAlign w:val="center"/>
-          </w:tcPr>
-          <w:p/>
+            <w:shd w:val="clear" w:color="auto" w:fill="F3EFF6"/>
+            <w:vAlign w:val="center"/>
+          </w:tcPr>
+          <w:p>
+            <w:r>
+              <w:t xml:space="preserve">Unit 4</w:t>
+            </w:r>
+          </w:p>
         </w:tc>
         <w:tc>
           <w:tcPr>
@@ -4852,7 +5216,7 @@
               <w:pStyle w:val="TableText"/>
             </w:pPr>
             <w:r>
-              <w:t>Notes 03 · Electromagnetic Spectrum</w:t>
+              <w:t xml:space="preserve">Notes 03 · Cell Supplementary</w:t>
             </w:r>
           </w:p>
         </w:tc>
@@ -4867,13 +5231,7 @@
               <w:jc w:val="center"/>
             </w:pPr>
             <w:r>
-              <w:t>第</w:t>
-            </w:r>
-            <w:r>
-              <w:t xml:space="preserve"> 5 </w:t>
-            </w:r>
-            <w:r>
-              <w:t>次课</w:t>
+              <w:t xml:space="preserve">第 8 次课</w:t>
             </w:r>
           </w:p>
         </w:tc>
@@ -4887,7 +5245,7 @@
               <w:pStyle w:val="TableText"/>
             </w:pPr>
             <w:r>
-              <w:t>聚焦可见光及光与物质作用</w:t>
+              <w:t xml:space="preserve">配合已讲结构理解功能，未逐项覆盖全部细胞器</w:t>
             </w:r>
           </w:p>
         </w:tc>
@@ -4900,10 +5258,14 @@
           <w:tcPr>
             <w:tcW w:w="1300" w:type="dxa"/>
             <w:vMerge/>
-            <w:shd w:val="clear" w:color="auto" w:fill="EEF5F0"/>
-            <w:vAlign w:val="center"/>
-          </w:tcPr>
-          <w:p/>
+            <w:shd w:val="clear" w:color="auto" w:fill="F3EFF6"/>
+            <w:vAlign w:val="center"/>
+          </w:tcPr>
+          <w:p>
+            <w:r>
+              <w:t xml:space="preserve">Unit 4</w:t>
+            </w:r>
+          </w:p>
         </w:tc>
         <w:tc>
           <w:tcPr>
@@ -4915,7 +5277,7 @@
               <w:pStyle w:val="TableText"/>
             </w:pPr>
             <w:r>
-              <w:t>Notes 04 · Vectors, Velocity, Acceleration</w:t>
+              <w:t xml:space="preserve">Notes 06 · Vascular and Non Vascular Plants</w:t>
             </w:r>
           </w:p>
         </w:tc>
@@ -4930,13 +5292,7 @@
               <w:jc w:val="center"/>
             </w:pPr>
             <w:r>
-              <w:t>第</w:t>
-            </w:r>
-            <w:r>
-              <w:t xml:space="preserve"> 6 </w:t>
-            </w:r>
-            <w:r>
-              <w:t>次课</w:t>
+              <w:t xml:space="preserve">第 9 次课</w:t>
             </w:r>
           </w:p>
         </w:tc>
@@ -4950,7 +5306,7 @@
               <w:pStyle w:val="TableText"/>
             </w:pPr>
             <w:r>
-              <w:t xml:space="preserve">标尺纸带、慢动作录像与等时位置比较；认识加速度</w:t>
+              <w:t xml:space="preserve">木质部的水路、气孔与蒸腾；维管与非维管植物</w:t>
             </w:r>
           </w:p>
         </w:tc>
@@ -4963,10 +5319,14 @@
           <w:tcPr>
             <w:tcW w:w="1300" w:type="dxa"/>
             <w:vMerge/>
-            <w:shd w:val="clear" w:color="auto" w:fill="EEF5F0"/>
-            <w:vAlign w:val="center"/>
-          </w:tcPr>
-          <w:p/>
+            <w:shd w:val="clear" w:color="auto" w:fill="F3EFF6"/>
+            <w:vAlign w:val="center"/>
+          </w:tcPr>
+          <w:p>
+            <w:r>
+              <w:t xml:space="preserve">Unit 4</w:t>
+            </w:r>
+          </w:p>
         </w:tc>
         <w:tc>
           <w:tcPr>
@@ -4978,7 +5338,7 @@
               <w:pStyle w:val="TableText"/>
             </w:pPr>
             <w:r>
-              <w:t>Notes 05 · Newton’s First Law</w:t>
+              <w:t xml:space="preserve">Notes 10 · Respiratory System</w:t>
             </w:r>
           </w:p>
         </w:tc>
@@ -4993,13 +5353,7 @@
               <w:jc w:val="center"/>
             </w:pPr>
             <w:r>
-              <w:t>第</w:t>
-            </w:r>
-            <w:r>
-              <w:t xml:space="preserve"> 6 </w:t>
-            </w:r>
-            <w:r>
-              <w:t>次课</w:t>
+              <w:t xml:space="preserve">第 7 次课</w:t>
             </w:r>
           </w:p>
         </w:tc>
@@ -5013,7 +5367,7 @@
               <w:pStyle w:val="TableText"/>
             </w:pPr>
             <w:r>
-              <w:t xml:space="preserve">简要介绍惯性与第一定律</w:t>
+              <w:t xml:space="preserve">只联系吸入氧气与呼出二氧化碳</w:t>
             </w:r>
           </w:p>
         </w:tc>
@@ -5026,10 +5380,14 @@
           <w:tcPr>
             <w:tcW w:w="1300" w:type="dxa"/>
             <w:vMerge/>
-            <w:shd w:val="clear" w:color="auto" w:fill="EEF5F0"/>
-            <w:vAlign w:val="center"/>
-          </w:tcPr>
-          <w:p/>
+            <w:shd w:val="clear" w:color="auto" w:fill="F3EFF6"/>
+            <w:vAlign w:val="center"/>
+          </w:tcPr>
+          <w:p>
+            <w:r>
+              <w:t xml:space="preserve">Unit 4</w:t>
+            </w:r>
+          </w:p>
         </w:tc>
         <w:tc>
           <w:tcPr>
@@ -5041,7 +5399,7 @@
               <w:pStyle w:val="TableText"/>
             </w:pPr>
             <w:r>
-              <w:t>Notes 06 · Newton’s Second Law</w:t>
+              <w:t xml:space="preserve">Homework 02 · Cell Vocabulary</w:t>
             </w:r>
           </w:p>
         </w:tc>
@@ -5056,13 +5414,7 @@
               <w:jc w:val="center"/>
             </w:pPr>
             <w:r>
-              <w:t>第</w:t>
-            </w:r>
-            <w:r>
-              <w:t xml:space="preserve"> 6 </w:t>
-            </w:r>
-            <w:r>
-              <w:t>次课</w:t>
+              <w:t xml:space="preserve">第 8 次课</w:t>
             </w:r>
           </w:p>
         </w:tc>
@@ -5076,524 +5428,7 @@
               <w:pStyle w:val="TableText"/>
             </w:pPr>
             <w:r>
-              <w:t xml:space="preserve">得到力、质量影响加速度的两条变化规律；尚未通过完整计算建立 F＝ma</w:t>
-            </w:r>
-          </w:p>
-        </w:tc>
-      </w:tr>
-      <w:tr>
-        <w:trPr>
-          <w:cantSplit/>
-        </w:trPr>
-        <w:tc>
-          <w:tcPr>
-            <w:tcW w:w="1300" w:type="dxa"/>
-            <w:vMerge/>
-            <w:shd w:val="clear" w:color="auto" w:fill="EEF5F0"/>
-            <w:vAlign w:val="center"/>
-          </w:tcPr>
-          <w:p/>
-        </w:tc>
-        <w:tc>
-          <w:tcPr>
-            <w:tcW w:w="4200" w:type="dxa"/>
-            <w:vAlign w:val="center"/>
-          </w:tcPr>
-          <w:p>
-            <w:pPr>
-              <w:pStyle w:val="TableText"/>
-            </w:pPr>
-            <w:r>
-              <w:t>Notes 07 · Newton’s Third Law</w:t>
-            </w:r>
-          </w:p>
-        </w:tc>
-        <w:tc>
-          <w:tcPr>
-            <w:tcW w:w="1100" w:type="dxa"/>
-            <w:vAlign w:val="center"/>
-          </w:tcPr>
-          <w:p>
-            <w:pPr>
-              <w:pStyle w:val="TableText"/>
-              <w:jc w:val="center"/>
-            </w:pPr>
-            <w:r>
-              <w:t>第</w:t>
-            </w:r>
-            <w:r>
-              <w:t xml:space="preserve"> 6 </w:t>
-            </w:r>
-            <w:r>
-              <w:t>次课</w:t>
-            </w:r>
-          </w:p>
-        </w:tc>
-        <w:tc>
-          <w:tcPr>
-            <w:tcW w:w="2760" w:type="dxa"/>
-            <w:vAlign w:val="center"/>
-          </w:tcPr>
-          <w:p>
-            <w:pPr>
-              <w:pStyle w:val="TableText"/>
-            </w:pPr>
-            <w:r>
-              <w:t xml:space="preserve">气球动力车与作用力、反作用力</w:t>
-            </w:r>
-          </w:p>
-        </w:tc>
-      </w:tr>
-      <w:tr>
-        <w:trPr>
-          <w:cantSplit/>
-        </w:trPr>
-        <w:tc>
-          <w:tcPr>
-            <w:tcW w:w="1300" w:type="dxa"/>
-            <w:vMerge/>
-            <w:shd w:val="clear" w:color="auto" w:fill="EEF5F0"/>
-            <w:vAlign w:val="center"/>
-          </w:tcPr>
-          <w:p/>
-        </w:tc>
-        <w:tc>
-          <w:tcPr>
-            <w:tcW w:w="4200" w:type="dxa"/>
-            <w:vAlign w:val="center"/>
-          </w:tcPr>
-          <w:p>
-            <w:pPr>
-              <w:pStyle w:val="TableText"/>
-            </w:pPr>
-            <w:r>
-              <w:t>Homework 02 · Light Energy Book</w:t>
-            </w:r>
-          </w:p>
-        </w:tc>
-        <w:tc>
-          <w:tcPr>
-            <w:tcW w:w="1100" w:type="dxa"/>
-            <w:vAlign w:val="center"/>
-          </w:tcPr>
-          <w:p>
-            <w:pPr>
-              <w:pStyle w:val="TableText"/>
-              <w:jc w:val="center"/>
-            </w:pPr>
-            <w:r>
-              <w:t>第</w:t>
-            </w:r>
-            <w:r>
-              <w:t xml:space="preserve"> 5 </w:t>
-            </w:r>
-            <w:r>
-              <w:t>次课</w:t>
-            </w:r>
-          </w:p>
-        </w:tc>
-        <w:tc>
-          <w:tcPr>
-            <w:tcW w:w="2760" w:type="dxa"/>
-            <w:vAlign w:val="center"/>
-          </w:tcPr>
-          <w:p>
-            <w:pPr>
-              <w:pStyle w:val="TableText"/>
-            </w:pPr>
-            <w:r>
-              <w:t>用四组实验完成应用与解释</w:t>
-            </w:r>
-          </w:p>
-        </w:tc>
-      </w:tr>
-      <w:tr>
-        <w:trPr>
-          <w:cantSplit/>
-        </w:trPr>
-        <w:tc>
-          <w:tcPr>
-            <w:tcW w:w="1300" w:type="dxa"/>
-            <w:vMerge w:val="restart"/>
-            <w:shd w:val="clear" w:color="auto" w:fill="F3EFF6"/>
-            <w:vAlign w:val="center"/>
-          </w:tcPr>
-          <w:p>
-            <w:pPr>
-              <w:pStyle w:val="TableText"/>
-              <w:jc w:val="center"/>
-            </w:pPr>
-            <w:r>
-              <w:rPr>
-                <w:b/>
-                <w:bCs/>
-                <w:color w:val="0B2545"/>
-              </w:rPr>
-              <w:t>Unit 4</w:t>
-            </w:r>
-          </w:p>
-        </w:tc>
-        <w:tc>
-          <w:tcPr>
-            <w:tcW w:w="4200" w:type="dxa"/>
-            <w:vAlign w:val="center"/>
-          </w:tcPr>
-          <w:p>
-            <w:pPr>
-              <w:pStyle w:val="TableText"/>
-            </w:pPr>
-            <w:r>
-              <w:t>Notes 01 · Characteristics of Living Things</w:t>
-            </w:r>
-          </w:p>
-        </w:tc>
-        <w:tc>
-          <w:tcPr>
-            <w:tcW w:w="1100" w:type="dxa"/>
-            <w:vAlign w:val="center"/>
-          </w:tcPr>
-          <w:p>
-            <w:pPr>
-              <w:pStyle w:val="TableText"/>
-              <w:jc w:val="center"/>
-            </w:pPr>
-            <w:r>
-              <w:t>第</w:t>
-            </w:r>
-            <w:r>
-              <w:t xml:space="preserve"> 8 </w:t>
-            </w:r>
-            <w:r>
-              <w:t>次课</w:t>
-            </w:r>
-          </w:p>
-        </w:tc>
-        <w:tc>
-          <w:tcPr>
-            <w:tcW w:w="2760" w:type="dxa"/>
-            <w:vAlign w:val="center"/>
-          </w:tcPr>
-          <w:p>
-            <w:pPr>
-              <w:pStyle w:val="TableText"/>
-            </w:pPr>
-            <w:r>
-              <w:t>细胞组成与生长；种豆启动后缺少连续观察数据</w:t>
-            </w:r>
-          </w:p>
-        </w:tc>
-      </w:tr>
-      <w:tr>
-        <w:trPr>
-          <w:cantSplit/>
-        </w:trPr>
-        <w:tc>
-          <w:tcPr>
-            <w:tcW w:w="1300" w:type="dxa"/>
-            <w:vMerge/>
-            <w:shd w:val="clear" w:color="auto" w:fill="F3EFF6"/>
-            <w:vAlign w:val="center"/>
-          </w:tcPr>
-          <w:p/>
-        </w:tc>
-        <w:tc>
-          <w:tcPr>
-            <w:tcW w:w="4200" w:type="dxa"/>
-            <w:vAlign w:val="center"/>
-          </w:tcPr>
-          <w:p>
-            <w:pPr>
-              <w:pStyle w:val="TableText"/>
-            </w:pPr>
-            <w:r>
-              <w:t>Notes 02 · Cell Structure</w:t>
-            </w:r>
-          </w:p>
-        </w:tc>
-        <w:tc>
-          <w:tcPr>
-            <w:tcW w:w="1100" w:type="dxa"/>
-            <w:vAlign w:val="center"/>
-          </w:tcPr>
-          <w:p>
-            <w:pPr>
-              <w:pStyle w:val="TableText"/>
-              <w:jc w:val="center"/>
-            </w:pPr>
-            <w:r>
-              <w:t>第</w:t>
-            </w:r>
-            <w:r>
-              <w:t xml:space="preserve"> 8 </w:t>
-            </w:r>
-            <w:r>
-              <w:t>次课</w:t>
-            </w:r>
-          </w:p>
-        </w:tc>
-        <w:tc>
-          <w:tcPr>
-            <w:tcW w:w="2760" w:type="dxa"/>
-            <w:vAlign w:val="center"/>
-          </w:tcPr>
-          <w:p>
-            <w:pPr>
-              <w:pStyle w:val="TableText"/>
-            </w:pPr>
-            <w:r>
-              <w:t>动植物细胞、主要结构及功能、细胞学说</w:t>
-            </w:r>
-          </w:p>
-        </w:tc>
-      </w:tr>
-      <w:tr>
-        <w:trPr>
-          <w:cantSplit/>
-        </w:trPr>
-        <w:tc>
-          <w:tcPr>
-            <w:tcW w:w="1300" w:type="dxa"/>
-            <w:vMerge/>
-            <w:shd w:val="clear" w:color="auto" w:fill="F3EFF6"/>
-            <w:vAlign w:val="center"/>
-          </w:tcPr>
-          <w:p/>
-        </w:tc>
-        <w:tc>
-          <w:tcPr>
-            <w:tcW w:w="4200" w:type="dxa"/>
-            <w:vAlign w:val="center"/>
-          </w:tcPr>
-          <w:p>
-            <w:pPr>
-              <w:pStyle w:val="TableText"/>
-            </w:pPr>
-            <w:r>
-              <w:t>Notes 03 · Cell Supplementary</w:t>
-            </w:r>
-          </w:p>
-        </w:tc>
-        <w:tc>
-          <w:tcPr>
-            <w:tcW w:w="1100" w:type="dxa"/>
-            <w:vAlign w:val="center"/>
-          </w:tcPr>
-          <w:p>
-            <w:pPr>
-              <w:pStyle w:val="TableText"/>
-              <w:jc w:val="center"/>
-            </w:pPr>
-            <w:r>
-              <w:t>第</w:t>
-            </w:r>
-            <w:r>
-              <w:t xml:space="preserve"> 8 </w:t>
-            </w:r>
-            <w:r>
-              <w:t>次课</w:t>
-            </w:r>
-          </w:p>
-        </w:tc>
-        <w:tc>
-          <w:tcPr>
-            <w:tcW w:w="2760" w:type="dxa"/>
-            <w:vAlign w:val="center"/>
-          </w:tcPr>
-          <w:p>
-            <w:pPr>
-              <w:pStyle w:val="TableText"/>
-            </w:pPr>
-            <w:r>
-              <w:t>配合已讲结构理解功能，未逐项覆盖全部细胞器</w:t>
-            </w:r>
-          </w:p>
-        </w:tc>
-      </w:tr>
-      <w:tr>
-        <w:trPr>
-          <w:cantSplit/>
-        </w:trPr>
-        <w:tc>
-          <w:tcPr>
-            <w:tcW w:w="1300" w:type="dxa"/>
-            <w:vMerge/>
-            <w:shd w:val="clear" w:color="auto" w:fill="F3EFF6"/>
-            <w:vAlign w:val="center"/>
-          </w:tcPr>
-          <w:p/>
-        </w:tc>
-        <w:tc>
-          <w:tcPr>
-            <w:tcW w:w="4200" w:type="dxa"/>
-            <w:vAlign w:val="center"/>
-          </w:tcPr>
-          <w:p>
-            <w:pPr>
-              <w:pStyle w:val="TableText"/>
-            </w:pPr>
-            <w:r>
-              <w:t>Notes 06 · Vascular and Non Vascular Plants</w:t>
-            </w:r>
-          </w:p>
-        </w:tc>
-        <w:tc>
-          <w:tcPr>
-            <w:tcW w:w="1100" w:type="dxa"/>
-            <w:vAlign w:val="center"/>
-          </w:tcPr>
-          <w:p>
-            <w:pPr>
-              <w:pStyle w:val="TableText"/>
-              <w:jc w:val="center"/>
-            </w:pPr>
-            <w:r>
-              <w:t>第</w:t>
-            </w:r>
-            <w:r>
-              <w:t xml:space="preserve"> 9 </w:t>
-            </w:r>
-            <w:r>
-              <w:t>次课</w:t>
-            </w:r>
-          </w:p>
-        </w:tc>
-        <w:tc>
-          <w:tcPr>
-            <w:tcW w:w="2760" w:type="dxa"/>
-            <w:vAlign w:val="center"/>
-          </w:tcPr>
-          <w:p>
-            <w:pPr>
-              <w:pStyle w:val="TableText"/>
-            </w:pPr>
-            <w:r>
-              <w:t>木质部、韧皮部、植物水路与蒸腾</w:t>
-            </w:r>
-          </w:p>
-        </w:tc>
-      </w:tr>
-      <w:tr>
-        <w:trPr>
-          <w:cantSplit/>
-        </w:trPr>
-        <w:tc>
-          <w:tcPr>
-            <w:tcW w:w="1300" w:type="dxa"/>
-            <w:vMerge/>
-            <w:shd w:val="clear" w:color="auto" w:fill="F3EFF6"/>
-            <w:vAlign w:val="center"/>
-          </w:tcPr>
-          <w:p/>
-        </w:tc>
-        <w:tc>
-          <w:tcPr>
-            <w:tcW w:w="4200" w:type="dxa"/>
-            <w:vAlign w:val="center"/>
-          </w:tcPr>
-          <w:p>
-            <w:pPr>
-              <w:pStyle w:val="TableText"/>
-            </w:pPr>
-            <w:r>
-              <w:t>Notes 10 · Respiratory System</w:t>
-            </w:r>
-          </w:p>
-        </w:tc>
-        <w:tc>
-          <w:tcPr>
-            <w:tcW w:w="1100" w:type="dxa"/>
-            <w:vAlign w:val="center"/>
-          </w:tcPr>
-          <w:p>
-            <w:pPr>
-              <w:pStyle w:val="TableText"/>
-              <w:jc w:val="center"/>
-            </w:pPr>
-            <w:r>
-              <w:t>第</w:t>
-            </w:r>
-            <w:r>
-              <w:t xml:space="preserve"> 7 </w:t>
-            </w:r>
-            <w:r>
-              <w:t>次课</w:t>
-            </w:r>
-          </w:p>
-        </w:tc>
-        <w:tc>
-          <w:tcPr>
-            <w:tcW w:w="2760" w:type="dxa"/>
-            <w:vAlign w:val="center"/>
-          </w:tcPr>
-          <w:p>
-            <w:pPr>
-              <w:pStyle w:val="TableText"/>
-            </w:pPr>
-            <w:r>
-              <w:t>只联系吸入氧气与呼出二氧化碳</w:t>
-            </w:r>
-          </w:p>
-        </w:tc>
-      </w:tr>
-      <w:tr>
-        <w:trPr>
-          <w:cantSplit/>
-        </w:trPr>
-        <w:tc>
-          <w:tcPr>
-            <w:tcW w:w="1300" w:type="dxa"/>
-            <w:vMerge/>
-            <w:shd w:val="clear" w:color="auto" w:fill="F3EFF6"/>
-            <w:vAlign w:val="center"/>
-          </w:tcPr>
-          <w:p/>
-        </w:tc>
-        <w:tc>
-          <w:tcPr>
-            <w:tcW w:w="4200" w:type="dxa"/>
-            <w:vAlign w:val="center"/>
-          </w:tcPr>
-          <w:p>
-            <w:pPr>
-              <w:pStyle w:val="TableText"/>
-            </w:pPr>
-            <w:r>
-              <w:t>Homework 02 · Cell Vocabulary</w:t>
-            </w:r>
-          </w:p>
-        </w:tc>
-        <w:tc>
-          <w:tcPr>
-            <w:tcW w:w="1100" w:type="dxa"/>
-            <w:vAlign w:val="center"/>
-          </w:tcPr>
-          <w:p>
-            <w:pPr>
-              <w:pStyle w:val="TableText"/>
-              <w:jc w:val="center"/>
-            </w:pPr>
-            <w:r>
-              <w:t>第</w:t>
-            </w:r>
-            <w:r>
-              <w:t xml:space="preserve"> 8 </w:t>
-            </w:r>
-            <w:r>
-              <w:t>次课</w:t>
-            </w:r>
-          </w:p>
-        </w:tc>
-        <w:tc>
-          <w:tcPr>
-            <w:tcW w:w="2760" w:type="dxa"/>
-            <w:vAlign w:val="center"/>
-          </w:tcPr>
-          <w:p>
-            <w:pPr>
-              <w:pStyle w:val="TableText"/>
-            </w:pPr>
-            <w:r>
-              <w:t>结合观察图使用细胞结构词汇</w:t>
+              <w:t xml:space="preserve">结合观察图使用细胞结构词汇</w:t>
             </w:r>
           </w:p>
         </w:tc>
@@ -5601,10 +5436,10 @@
     </w:tbl>
     <w:p>
       <w:pPr>
-        <w:pStyle w:val="2"/>
-      </w:pPr>
-      <w:r>
-        <w:t>覆盖范围说明</w:t>
+        <w:pStyle w:val="1"/>
+      </w:pPr>
+      <w:r>
+        <w:t xml:space="preserve">覆盖范围说明</w:t>
       </w:r>
     </w:p>
     <w:p>
@@ -5614,38 +5449,10 @@
           <w:ilvl w:val="0"/>
           <w:numId w:val="1"/>
         </w:numPr>
-      </w:pPr>
-      <w:r>
-        <w:rPr>
-          <w:b/>
-          <w:bCs/>
-          <w:color w:val="0B2545"/>
-        </w:rPr>
-        <w:t>Unit 1</w:t>
-      </w:r>
-      <w:r>
-        <w:rPr>
-          <w:b/>
-          <w:bCs/>
-          <w:color w:val="0B2545"/>
-        </w:rPr>
-        <w:t>：</w:t>
-      </w:r>
-      <w:r>
-        <w:rPr>
-          <w:b/>
-          <w:bCs/>
-          <w:color w:val="0B2545"/>
-        </w:rPr>
-        <w:t xml:space="preserve">Notes 01–03 </w:t>
-      </w:r>
-      <w:r>
-        <w:rPr>
-          <w:b/>
-          <w:bCs/>
-          <w:color w:val="0B2545"/>
-        </w:rPr>
-        <w:t>的科学方法核心已经覆盖，并继续贯穿后续实验。</w:t>
+        <w:spacing w:after="40"/>
+      </w:pPr>
+      <w:r>
+        <w:t xml:space="preserve">Unit 1：Notes 01–03 的科学方法核心已经覆盖，并继续贯穿后续实验。</w:t>
       </w:r>
     </w:p>
     <w:p>
@@ -5655,58 +5462,10 @@
           <w:ilvl w:val="0"/>
           <w:numId w:val="1"/>
         </w:numPr>
-      </w:pPr>
-      <w:r>
-        <w:rPr>
-          <w:b/>
-          <w:bCs/>
-          <w:color w:val="0B2545"/>
-        </w:rPr>
-        <w:t>Unit 2</w:t>
-      </w:r>
-      <w:r>
-        <w:rPr>
-          <w:b/>
-          <w:bCs/>
-          <w:color w:val="0B2545"/>
-        </w:rPr>
-        <w:t>：</w:t>
-      </w:r>
-      <w:r>
-        <w:t>Notes 01</w:t>
-      </w:r>
-      <w:r>
-        <w:t>、</w:t>
-      </w:r>
-      <w:r>
-        <w:t xml:space="preserve">02 </w:t>
-      </w:r>
-      <w:r>
-        <w:t>的实验核心已经覆盖；</w:t>
-      </w:r>
-      <w:r>
-        <w:t xml:space="preserve">Notes 03 </w:t>
-      </w:r>
-      <w:r>
-        <w:t>目前只完成原子与元素等基础，</w:t>
-      </w:r>
-      <w:r>
-        <w:t>Period Square</w:t>
-      </w:r>
-      <w:r>
-        <w:t>、</w:t>
-      </w:r>
-      <w:r>
-        <w:t>Bohr model</w:t>
-      </w:r>
-      <w:r>
-        <w:t>、</w:t>
-      </w:r>
-      <w:r>
-        <w:t xml:space="preserve">ions/isotopes </w:t>
-      </w:r>
-      <w:r>
-        <w:t>等尚未计入本阶段。</w:t>
+        <w:spacing w:after="40"/>
+      </w:pPr>
+      <w:r>
+        <w:t xml:space="preserve">Unit 2：Notes 01、02 的实验核心已经覆盖；Notes 03 目前只完成原子与元素等基础，Period Square、Bohr model、ions/isotopes 等尚未计入本阶段。</w:t>
       </w:r>
     </w:p>
     <w:p>
@@ -5716,6 +5475,7 @@
           <w:ilvl w:val="0"/>
           <w:numId w:val="1"/>
         </w:numPr>
+        <w:spacing w:after="40"/>
       </w:pPr>
       <w:r>
         <w:t xml:space="preserve">Unit 3：Notes 01 完成能量转移/转化的入口，Notes 02 完成三种热传递核心，Notes 03 完成可见光及光与物质作用的重点；第 6 次课联系 Notes 04 的加速度与 Notes 07 的作用力、反作用力；Notes 06 得到力、质量影响加速度的两条变化规律，尚未通过完整计算建立 F＝ma 的定量关系；Notes 05 的第一定律仅作简要介绍。</w:t>
@@ -5728,119 +5488,10 @@
           <w:ilvl w:val="0"/>
           <w:numId w:val="1"/>
         </w:numPr>
-      </w:pPr>
-      <w:r>
-        <w:rPr>
-          <w:b/>
-          <w:bCs/>
-          <w:color w:val="0B2545"/>
-        </w:rPr>
-        <w:lastRenderedPageBreak/>
-        <w:t>Unit 4</w:t>
-      </w:r>
-      <w:r>
-        <w:rPr>
-          <w:b/>
-          <w:bCs/>
-          <w:color w:val="0B2545"/>
-        </w:rPr>
-        <w:t>：第</w:t>
-      </w:r>
-      <w:r>
-        <w:rPr>
-          <w:b/>
-          <w:bCs/>
-          <w:color w:val="0B2545"/>
-        </w:rPr>
-        <w:t xml:space="preserve"> 8 </w:t>
-      </w:r>
-      <w:r>
-        <w:rPr>
-          <w:b/>
-          <w:bCs/>
-          <w:color w:val="0B2545"/>
-        </w:rPr>
-        <w:t>节重点涉及</w:t>
-      </w:r>
-      <w:r>
-        <w:rPr>
-          <w:b/>
-          <w:bCs/>
-          <w:color w:val="0B2545"/>
-        </w:rPr>
-        <w:t xml:space="preserve"> Notes 01–03 </w:t>
-      </w:r>
-      <w:r>
-        <w:rPr>
-          <w:b/>
-          <w:bCs/>
-          <w:color w:val="0B2545"/>
-        </w:rPr>
-        <w:t>的生命特征、细胞结构与细胞学说；第</w:t>
-      </w:r>
-      <w:r>
-        <w:rPr>
-          <w:b/>
-          <w:bCs/>
-          <w:color w:val="0B2545"/>
-        </w:rPr>
-        <w:t xml:space="preserve"> 9 </w:t>
-      </w:r>
-      <w:r>
-        <w:rPr>
-          <w:b/>
-          <w:bCs/>
-          <w:color w:val="0B2545"/>
-        </w:rPr>
-        <w:t>节涉及</w:t>
-      </w:r>
-      <w:r>
-        <w:rPr>
-          <w:b/>
-          <w:bCs/>
-          <w:color w:val="0B2545"/>
-        </w:rPr>
-        <w:t xml:space="preserve"> Notes 06 </w:t>
-      </w:r>
-      <w:r>
-        <w:rPr>
-          <w:b/>
-          <w:bCs/>
-          <w:color w:val="0B2545"/>
-        </w:rPr>
-        <w:t>的植物运输；第</w:t>
-      </w:r>
-      <w:r>
-        <w:rPr>
-          <w:b/>
-          <w:bCs/>
-          <w:color w:val="0B2545"/>
-        </w:rPr>
-        <w:t xml:space="preserve"> 7 </w:t>
-      </w:r>
-      <w:r>
-        <w:rPr>
-          <w:b/>
-          <w:bCs/>
-          <w:color w:val="0B2545"/>
-        </w:rPr>
-        <w:t>节联系</w:t>
-      </w:r>
-      <w:r>
-        <w:rPr>
-          <w:b/>
-          <w:bCs/>
-          <w:color w:val="0B2545"/>
-        </w:rPr>
-        <w:t xml:space="preserve"> Notes 10 </w:t>
-      </w:r>
-      <w:r>
-        <w:rPr>
-          <w:b/>
-          <w:bCs/>
-          <w:color w:val="0B2545"/>
-        </w:rPr>
-        <w:t>的氧气与二氧化碳。其余分类、植物繁殖及人体系统内容未计为完整覆盖。</w:t>
+        <w:spacing w:after="40"/>
+      </w:pPr>
+      <w:r>
+        <w:t xml:space="preserve">Unit 4：第 8 节重点涉及 Notes 01–03 的生命特征、细胞结构与细胞学说；第 9 节涉及 Notes 06 的植物运输；第 7 节联系 Notes 10 的氧气与二氧化碳。其余分类、植物繁殖及人体系统内容未计为完整覆盖。</w:t>
       </w:r>
     </w:p>
     <w:p>
@@ -5850,20 +5501,18 @@
           <w:ilvl w:val="0"/>
           <w:numId w:val="1"/>
         </w:numPr>
-      </w:pPr>
-      <w:r>
-        <w:t>Unit 5</w:t>
-      </w:r>
-      <w:r>
-        <w:t>：空间科学尚未纳入这九次实验课。</w:t>
-      </w:r>
-    </w:p>
-    <w:p>
-      <w:pPr>
-        <w:pStyle w:val="2"/>
-      </w:pPr>
-      <w:r>
-        <w:t>本阶段形成的学习习惯</w:t>
+        <w:spacing w:after="40"/>
+      </w:pPr>
+      <w:r>
+        <w:t xml:space="preserve">Unit 5：空间科学尚未纳入这九次实验课。</w:t>
+      </w:r>
+    </w:p>
+    <w:p>
+      <w:pPr>
+        <w:pStyle w:val="1"/>
+      </w:pPr>
+      <w:r>
+        <w:t xml:space="preserve">本阶段形成的学习习惯</w:t>
       </w:r>
     </w:p>
     <w:p>
@@ -5873,20 +5522,10 @@
           <w:ilvl w:val="0"/>
           <w:numId w:val="1"/>
         </w:numPr>
-      </w:pPr>
-      <w:r>
-        <w:rPr>
-          <w:b/>
-          <w:bCs/>
-          <w:color w:val="80627D"/>
-        </w:rPr>
-        <w:t>先问清楚变量：</w:t>
-      </w:r>
-      <w:r>
-        <w:rPr>
-          <w:color w:val="80627D"/>
-        </w:rPr>
-        <w:t>能说出这次实验改变什么、测量什么、哪些条件必须保持不变。</w:t>
+        <w:spacing w:after="40"/>
+      </w:pPr>
+      <w:r>
+        <w:t xml:space="preserve">先问清楚变量：能说出这次实验改变什么、测量什么、哪些条件必须保持不变。</w:t>
       </w:r>
     </w:p>
     <w:p>
@@ -5896,20 +5535,10 @@
           <w:ilvl w:val="0"/>
           <w:numId w:val="1"/>
         </w:numPr>
-      </w:pPr>
-      <w:r>
-        <w:rPr>
-          <w:b/>
-          <w:bCs/>
-          <w:color w:val="80627D"/>
-        </w:rPr>
-        <w:t>把观察和解释分开：</w:t>
-      </w:r>
-      <w:r>
-        <w:rPr>
-          <w:color w:val="80627D"/>
-        </w:rPr>
-        <w:t>先记录看见的现象和数据，再说明这些证据支持什么结论。</w:t>
+        <w:spacing w:after="40"/>
+      </w:pPr>
+      <w:r>
+        <w:t xml:space="preserve">把观察和解释分开：先记录看见的现象和数据，再说明这些证据支持什么结论。</w:t>
       </w:r>
     </w:p>
     <w:p>
@@ -5919,20 +5548,10 @@
           <w:ilvl w:val="0"/>
           <w:numId w:val="1"/>
         </w:numPr>
-      </w:pPr>
-      <w:r>
-        <w:rPr>
-          <w:b/>
-          <w:bCs/>
-          <w:color w:val="80627D"/>
-        </w:rPr>
-        <w:t>允许数据修正猜想：</w:t>
-      </w:r>
-      <w:r>
-        <w:rPr>
-          <w:color w:val="80627D"/>
-        </w:rPr>
-        <w:t>当结果与直觉不一致时，不改记录，而是检查误差、补做测量或修改原来的判断。</w:t>
+        <w:spacing w:after="40"/>
+      </w:pPr>
+      <w:r>
+        <w:t xml:space="preserve">允许数据修正猜想：当结果与直觉不一致时，不改记录，而是检查误差、补做测量或修改原来的判断。</w:t>
       </w:r>
     </w:p>
     <w:p>
@@ -5942,32 +5561,10 @@
           <w:ilvl w:val="0"/>
           <w:numId w:val="1"/>
         </w:numPr>
-      </w:pPr>
-      <w:r>
-        <w:rPr>
-          <w:b/>
-          <w:bCs/>
-          <w:color w:val="80627D"/>
-        </w:rPr>
-        <w:t>建立中英文概念连接：</w:t>
-      </w:r>
-      <w:r>
-        <w:rPr>
-          <w:color w:val="80627D"/>
-        </w:rPr>
-        <w:t>在真实实验情境中使用</w:t>
-      </w:r>
-      <w:r>
-        <w:rPr>
-          <w:color w:val="80627D"/>
-        </w:rPr>
-        <w:t xml:space="preserve"> school notes </w:t>
-      </w:r>
-      <w:r>
-        <w:rPr>
-          <w:color w:val="80627D"/>
-        </w:rPr>
-        <w:t>里的关键词，而不是脱离现象单独背词。</w:t>
+        <w:spacing w:after="40"/>
+      </w:pPr>
+      <w:r>
+        <w:t xml:space="preserve">建立中英文概念连接：在真实实验情境中使用 school notes 里的关键词，而不是脱离现象单独背词。</w:t>
       </w:r>
     </w:p>
     <w:p>
@@ -5984,34 +5581,10 @@
           <w:b/>
           <w:bCs/>
         </w:rPr>
-        <w:t>给家长的一句话｜</w:t>
-      </w:r>
-      <w:r>
-        <w:t>在家中回顾时，可以少问</w:t>
-      </w:r>
-      <w:r>
-        <w:t>“</w:t>
-      </w:r>
-      <w:r>
-        <w:t>记住了哪个答案</w:t>
-      </w:r>
-      <w:r>
-        <w:t>”</w:t>
-      </w:r>
-      <w:r>
-        <w:t>，多问</w:t>
-      </w:r>
-      <w:r>
-        <w:t>“</w:t>
-      </w:r>
-      <w:r>
-        <w:t>你观察到了什么、怎样保证比较公平、哪条证据支持你的解释</w:t>
-      </w:r>
-      <w:r>
-        <w:t>”</w:t>
-      </w:r>
-      <w:r>
-        <w:t>。这正是这九次课反复练习的科学思维。</w:t>
+        <w:t xml:space="preserve">给家长的一句话｜</w:t>
+      </w:r>
+      <w:r>
+        <w:t xml:space="preserve">在家中回顾时，可以少问“记住了哪个答案”，多问“你观察到了什么、怎样保证比较公平、哪条证据支持你的解释”。这正是这九次课反复练习的科学思维。</w:t>
       </w:r>
     </w:p>
     <w:sectPr>

</xml_diff>